<commit_message>
구현: CAPL DLL Phase 1 ABI 기반 추가
- Win32/x86 M485E DLL과 CAPL_DLL_INFO4 기반 21개 API를 추가

- 독립 ABI Probe 및 CANalyzer CAPL Probe를 추가

- 빌드 구성과 개발 문서의 추적성 내용을 최신화
</commit_message>
<xml_diff>
--- a/docs/02_FunctionalSpecification/Modbus485Emulator_Functional_Specification.docx
+++ b/docs/02_FunctionalSpecification/Modbus485Emulator_Functional_Specification.docx
@@ -242,7 +242,7 @@
                 <w:rFonts w:ascii="Malgun Gothic" w:hAnsi="Malgun Gothic" w:eastAsia="Malgun Gothic"/>
                 <w:sz w:val="20"/>
               </w:rPr>
-              <w:t>0.9 / Baseline Candidate</w:t>
+              <w:t>0.10 / Baseline Candidate</w:t>
             </w:r>
           </w:p>
         </w:tc>
@@ -292,7 +292,7 @@
                 <w:rFonts w:ascii="Malgun Gothic" w:hAnsi="Malgun Gothic" w:eastAsia="Malgun Gothic"/>
                 <w:sz w:val="20"/>
               </w:rPr>
-              <w:t>2026-08-08</w:t>
+              <w:t>2026-08-09</w:t>
             </w:r>
           </w:p>
         </w:tc>
@@ -575,6 +575,111 @@
                 <w:sz w:val="17"/>
               </w:rPr>
               <w:t>확정 요구사항과 신규 설계를 기준으로 한 초기 공식 Baseline 후보</w:t>
+            </w:r>
+          </w:p>
+        </w:tc>
+      </w:tr>
+      <w:tr>
+        <w:trPr>
+          <w:cantSplit w:val="true"/>
+        </w:trPr>
+        <w:tc>
+          <w:tcPr>
+            <w:tcW w:type="dxa" w:w="1152"/>
+            <w:tcMar>
+              <w:top w:w="80" w:type="dxa"/>
+              <w:start w:w="120" w:type="dxa"/>
+              <w:bottom w:w="80" w:type="dxa"/>
+              <w:end w:w="120" w:type="dxa"/>
+            </w:tcMar>
+            <w:vAlign w:val="center"/>
+          </w:tcPr>
+          <w:p>
+            <w:pPr>
+              <w:spacing w:after="0" w:line="240" w:lineRule="auto"/>
+            </w:pPr>
+            <w:r>
+              <w:rPr>
+                <w:rFonts w:ascii="Malgun Gothic" w:hAnsi="Malgun Gothic" w:eastAsia="Malgun Gothic"/>
+                <w:color w:val="1F2937"/>
+                <w:sz w:val="17"/>
+              </w:rPr>
+              <w:t>0.10</w:t>
+            </w:r>
+          </w:p>
+        </w:tc>
+        <w:tc>
+          <w:tcPr>
+            <w:tcW w:type="dxa" w:w="1584"/>
+            <w:tcMar>
+              <w:top w:w="80" w:type="dxa"/>
+              <w:start w:w="120" w:type="dxa"/>
+              <w:bottom w:w="80" w:type="dxa"/>
+              <w:end w:w="120" w:type="dxa"/>
+            </w:tcMar>
+            <w:vAlign w:val="center"/>
+          </w:tcPr>
+          <w:p>
+            <w:pPr>
+              <w:spacing w:after="0" w:line="240" w:lineRule="auto"/>
+            </w:pPr>
+            <w:r>
+              <w:rPr>
+                <w:rFonts w:ascii="Malgun Gothic" w:hAnsi="Malgun Gothic" w:eastAsia="Malgun Gothic"/>
+                <w:color w:val="1F2937"/>
+                <w:sz w:val="17"/>
+              </w:rPr>
+              <w:t>2026-08-09</w:t>
+            </w:r>
+          </w:p>
+        </w:tc>
+        <w:tc>
+          <w:tcPr>
+            <w:tcW w:type="dxa" w:w="2160"/>
+            <w:tcMar>
+              <w:top w:w="80" w:type="dxa"/>
+              <w:start w:w="120" w:type="dxa"/>
+              <w:bottom w:w="80" w:type="dxa"/>
+              <w:end w:w="120" w:type="dxa"/>
+            </w:tcMar>
+            <w:vAlign w:val="center"/>
+          </w:tcPr>
+          <w:p>
+            <w:pPr>
+              <w:spacing w:after="0" w:line="240" w:lineRule="auto"/>
+            </w:pPr>
+            <w:r>
+              <w:rPr>
+                <w:rFonts w:ascii="Malgun Gothic" w:hAnsi="Malgun Gothic" w:eastAsia="Malgun Gothic"/>
+                <w:color w:val="1F2937"/>
+                <w:sz w:val="17"/>
+              </w:rPr>
+              <w:t>Baseline Candidate</w:t>
+            </w:r>
+          </w:p>
+        </w:tc>
+        <w:tc>
+          <w:tcPr>
+            <w:tcW w:type="dxa" w:w="4464"/>
+            <w:tcMar>
+              <w:top w:w="80" w:type="dxa"/>
+              <w:start w:w="120" w:type="dxa"/>
+              <w:bottom w:w="80" w:type="dxa"/>
+              <w:end w:w="120" w:type="dxa"/>
+            </w:tcMar>
+            <w:vAlign w:val="center"/>
+          </w:tcPr>
+          <w:p>
+            <w:pPr>
+              <w:spacing w:after="0" w:line="240" w:lineRule="auto"/>
+            </w:pPr>
+            <w:r>
+              <w:rPr>
+                <w:rFonts w:ascii="Malgun Gothic" w:hAnsi="Malgun Gothic" w:eastAsia="Malgun Gothic"/>
+                <w:color w:val="1F2937"/>
+                <w:sz w:val="17"/>
+              </w:rPr>
+              <w:t>RTM 정방향 매핑 기준으로 37개 기능사양의 Requirement 역추적 정규화</w:t>
             </w:r>
           </w:p>
         </w:tc>
@@ -1932,6 +2037,7 @@
           </w:tcPr>
           <w:p>
             <w:pPr>
+              <w:keepNext/>
               <w:jc w:val="center"/>
             </w:pPr>
             <w:r>
@@ -1959,6 +2065,7 @@
           </w:tcPr>
           <w:p>
             <w:pPr>
+              <w:keepNext/>
               <w:jc w:val="center"/>
             </w:pPr>
             <w:r>
@@ -1990,6 +2097,7 @@
           </w:tcPr>
           <w:p>
             <w:pPr>
+              <w:keepNext/>
               <w:spacing w:after="0" w:line="240" w:lineRule="auto"/>
             </w:pPr>
             <w:r>
@@ -2015,15 +2123,16 @@
           </w:tcPr>
           <w:p>
             <w:pPr>
-              <w:spacing w:after="0" w:line="240" w:lineRule="auto"/>
-            </w:pPr>
-            <w:r>
-              <w:rPr>
-                <w:rFonts w:ascii="Malgun Gothic" w:hAnsi="Malgun Gothic" w:eastAsia="Malgun Gothic"/>
-                <w:color w:val="1F2937"/>
-                <w:sz w:val="16"/>
-              </w:rPr>
-              <w:t>REQ-FUNC-001; REQ-IF-001~003; REQ-COMP-001~004</w:t>
+              <w:keepNext/>
+              <w:spacing w:after="0" w:line="240" w:lineRule="auto"/>
+            </w:pPr>
+            <w:r>
+              <w:rPr>
+                <w:rFonts w:ascii="Malgun Gothic" w:hAnsi="Malgun Gothic" w:eastAsia="Malgun Gothic"/>
+                <w:color w:val="1F2937"/>
+                <w:sz w:val="16"/>
+              </w:rPr>
+              <w:t>REQ-FUNC-001; REQ-IF-001~004; REQ-PERF-003; REQ-COMP-001~004</w:t>
             </w:r>
           </w:p>
         </w:tc>
@@ -2045,6 +2154,7 @@
           </w:tcPr>
           <w:p>
             <w:pPr>
+              <w:keepNext/>
               <w:spacing w:after="0" w:line="240" w:lineRule="auto"/>
             </w:pPr>
             <w:r>
@@ -2070,6 +2180,7 @@
           </w:tcPr>
           <w:p>
             <w:pPr>
+              <w:keepNext/>
               <w:spacing w:after="0" w:line="240" w:lineRule="auto"/>
             </w:pPr>
             <w:r>
@@ -2100,6 +2211,7 @@
           </w:tcPr>
           <w:p>
             <w:pPr>
+              <w:keepNext/>
               <w:spacing w:after="0" w:line="240" w:lineRule="auto"/>
             </w:pPr>
             <w:r>
@@ -2125,6 +2237,7 @@
           </w:tcPr>
           <w:p>
             <w:pPr>
+              <w:keepNext/>
               <w:spacing w:after="0" w:line="240" w:lineRule="auto"/>
             </w:pPr>
             <w:r>
@@ -2155,6 +2268,7 @@
           </w:tcPr>
           <w:p>
             <w:pPr>
+              <w:keepNext/>
               <w:spacing w:after="0" w:line="240" w:lineRule="auto"/>
             </w:pPr>
             <w:r>
@@ -2180,6 +2294,7 @@
           </w:tcPr>
           <w:p>
             <w:pPr>
+              <w:keepNext/>
               <w:spacing w:after="0" w:line="240" w:lineRule="auto"/>
             </w:pPr>
             <w:r>
@@ -2210,6 +2325,7 @@
           </w:tcPr>
           <w:p>
             <w:pPr>
+              <w:keepNext/>
               <w:spacing w:after="0" w:line="240" w:lineRule="auto"/>
             </w:pPr>
             <w:r>
@@ -2235,6 +2351,7 @@
           </w:tcPr>
           <w:p>
             <w:pPr>
+              <w:keepNext/>
               <w:spacing w:after="0" w:line="240" w:lineRule="auto"/>
             </w:pPr>
             <w:r>
@@ -2271,6 +2388,7 @@
           </w:tcPr>
           <w:p>
             <w:pPr>
+              <w:keepNext/>
               <w:spacing w:after="0" w:line="240" w:lineRule="auto"/>
             </w:pPr>
             <w:r>
@@ -2296,6 +2414,7 @@
           </w:tcPr>
           <w:p>
             <w:pPr>
+              <w:keepNext/>
               <w:spacing w:after="0" w:line="240" w:lineRule="auto"/>
             </w:pPr>
             <w:r>
@@ -2425,6 +2544,7 @@
           </w:tcPr>
           <w:p>
             <w:pPr>
+              <w:keepNext/>
               <w:jc w:val="center"/>
             </w:pPr>
             <w:r>
@@ -2452,6 +2572,7 @@
           </w:tcPr>
           <w:p>
             <w:pPr>
+              <w:keepNext/>
               <w:jc w:val="center"/>
             </w:pPr>
             <w:r>
@@ -2483,6 +2604,7 @@
           </w:tcPr>
           <w:p>
             <w:pPr>
+              <w:keepNext/>
               <w:spacing w:after="0" w:line="240" w:lineRule="auto"/>
             </w:pPr>
             <w:r>
@@ -2508,15 +2630,16 @@
           </w:tcPr>
           <w:p>
             <w:pPr>
-              <w:spacing w:after="0" w:line="240" w:lineRule="auto"/>
-            </w:pPr>
-            <w:r>
-              <w:rPr>
-                <w:rFonts w:ascii="Malgun Gothic" w:hAnsi="Malgun Gothic" w:eastAsia="Malgun Gothic"/>
-                <w:color w:val="1F2937"/>
-                <w:sz w:val="16"/>
-              </w:rPr>
-              <w:t>REQ-FUNC-009~010; REQ-DATA-014; REQ-IF-010</w:t>
+              <w:keepNext/>
+              <w:spacing w:after="0" w:line="240" w:lineRule="auto"/>
+            </w:pPr>
+            <w:r>
+              <w:rPr>
+                <w:rFonts w:ascii="Malgun Gothic" w:hAnsi="Malgun Gothic" w:eastAsia="Malgun Gothic"/>
+                <w:color w:val="1F2937"/>
+                <w:sz w:val="16"/>
+              </w:rPr>
+              <w:t>REQ-DATA-014; REQ-IF-010</w:t>
             </w:r>
           </w:p>
         </w:tc>
@@ -2538,6 +2661,7 @@
           </w:tcPr>
           <w:p>
             <w:pPr>
+              <w:keepNext/>
               <w:spacing w:after="0" w:line="240" w:lineRule="auto"/>
             </w:pPr>
             <w:r>
@@ -2563,6 +2687,7 @@
           </w:tcPr>
           <w:p>
             <w:pPr>
+              <w:keepNext/>
               <w:spacing w:after="0" w:line="240" w:lineRule="auto"/>
             </w:pPr>
             <w:r>
@@ -2593,6 +2718,7 @@
           </w:tcPr>
           <w:p>
             <w:pPr>
+              <w:keepNext/>
               <w:spacing w:after="0" w:line="240" w:lineRule="auto"/>
             </w:pPr>
             <w:r>
@@ -2618,6 +2744,7 @@
           </w:tcPr>
           <w:p>
             <w:pPr>
+              <w:keepNext/>
               <w:spacing w:after="0" w:line="240" w:lineRule="auto"/>
             </w:pPr>
             <w:r>
@@ -2648,6 +2775,7 @@
           </w:tcPr>
           <w:p>
             <w:pPr>
+              <w:keepNext/>
               <w:spacing w:after="0" w:line="240" w:lineRule="auto"/>
             </w:pPr>
             <w:r>
@@ -2673,6 +2801,7 @@
           </w:tcPr>
           <w:p>
             <w:pPr>
+              <w:keepNext/>
               <w:spacing w:after="0" w:line="240" w:lineRule="auto"/>
             </w:pPr>
             <w:r>
@@ -2703,6 +2832,7 @@
           </w:tcPr>
           <w:p>
             <w:pPr>
+              <w:keepNext/>
               <w:spacing w:after="0" w:line="240" w:lineRule="auto"/>
             </w:pPr>
             <w:r>
@@ -2728,6 +2858,7 @@
           </w:tcPr>
           <w:p>
             <w:pPr>
+              <w:keepNext/>
               <w:spacing w:after="0" w:line="240" w:lineRule="auto"/>
             </w:pPr>
             <w:r>
@@ -2764,6 +2895,7 @@
           </w:tcPr>
           <w:p>
             <w:pPr>
+              <w:keepNext/>
               <w:spacing w:after="0" w:line="240" w:lineRule="auto"/>
             </w:pPr>
             <w:r>
@@ -2789,6 +2921,7 @@
           </w:tcPr>
           <w:p>
             <w:pPr>
+              <w:keepNext/>
               <w:spacing w:after="0" w:line="240" w:lineRule="auto"/>
             </w:pPr>
             <w:r>
@@ -2926,6 +3059,7 @@
           </w:tcPr>
           <w:p>
             <w:pPr>
+              <w:keepNext/>
               <w:jc w:val="center"/>
             </w:pPr>
             <w:r>
@@ -2953,6 +3087,7 @@
           </w:tcPr>
           <w:p>
             <w:pPr>
+              <w:keepNext/>
               <w:jc w:val="center"/>
             </w:pPr>
             <w:r>
@@ -2984,6 +3119,7 @@
           </w:tcPr>
           <w:p>
             <w:pPr>
+              <w:keepNext/>
               <w:spacing w:after="0" w:line="240" w:lineRule="auto"/>
             </w:pPr>
             <w:r>
@@ -3009,15 +3145,16 @@
           </w:tcPr>
           <w:p>
             <w:pPr>
-              <w:spacing w:after="0" w:line="240" w:lineRule="auto"/>
-            </w:pPr>
-            <w:r>
-              <w:rPr>
-                <w:rFonts w:ascii="Malgun Gothic" w:hAnsi="Malgun Gothic" w:eastAsia="Malgun Gothic"/>
-                <w:color w:val="1F2937"/>
-                <w:sz w:val="16"/>
-              </w:rPr>
-              <w:t>REQ-FUNC-009~010; REQ-SEC-001,REQ-SEC-003</w:t>
+              <w:keepNext/>
+              <w:spacing w:after="0" w:line="240" w:lineRule="auto"/>
+            </w:pPr>
+            <w:r>
+              <w:rPr>
+                <w:rFonts w:ascii="Malgun Gothic" w:hAnsi="Malgun Gothic" w:eastAsia="Malgun Gothic"/>
+                <w:color w:val="1F2937"/>
+                <w:sz w:val="16"/>
+              </w:rPr>
+              <w:t>REQ-FUNC-009~010; REQ-SEC-001, REQ-SEC-003</w:t>
             </w:r>
           </w:p>
         </w:tc>
@@ -3039,6 +3176,7 @@
           </w:tcPr>
           <w:p>
             <w:pPr>
+              <w:keepNext/>
               <w:spacing w:after="0" w:line="240" w:lineRule="auto"/>
             </w:pPr>
             <w:r>
@@ -3064,6 +3202,7 @@
           </w:tcPr>
           <w:p>
             <w:pPr>
+              <w:keepNext/>
               <w:spacing w:after="0" w:line="240" w:lineRule="auto"/>
             </w:pPr>
             <w:r>
@@ -3094,6 +3233,7 @@
           </w:tcPr>
           <w:p>
             <w:pPr>
+              <w:keepNext/>
               <w:spacing w:after="0" w:line="240" w:lineRule="auto"/>
             </w:pPr>
             <w:r>
@@ -3119,6 +3259,7 @@
           </w:tcPr>
           <w:p>
             <w:pPr>
+              <w:keepNext/>
               <w:spacing w:after="0" w:line="240" w:lineRule="auto"/>
             </w:pPr>
             <w:r>
@@ -3149,6 +3290,7 @@
           </w:tcPr>
           <w:p>
             <w:pPr>
+              <w:keepNext/>
               <w:spacing w:after="0" w:line="240" w:lineRule="auto"/>
             </w:pPr>
             <w:r>
@@ -3174,6 +3316,7 @@
           </w:tcPr>
           <w:p>
             <w:pPr>
+              <w:keepNext/>
               <w:spacing w:after="0" w:line="240" w:lineRule="auto"/>
             </w:pPr>
             <w:r>
@@ -3204,6 +3347,7 @@
           </w:tcPr>
           <w:p>
             <w:pPr>
+              <w:keepNext/>
               <w:spacing w:after="0" w:line="240" w:lineRule="auto"/>
             </w:pPr>
             <w:r>
@@ -3229,6 +3373,7 @@
           </w:tcPr>
           <w:p>
             <w:pPr>
+              <w:keepNext/>
               <w:spacing w:after="0" w:line="240" w:lineRule="auto"/>
             </w:pPr>
             <w:r>
@@ -3263,6 +3408,7 @@
           </w:tcPr>
           <w:p>
             <w:pPr>
+              <w:keepNext/>
               <w:spacing w:after="0" w:line="240" w:lineRule="auto"/>
             </w:pPr>
             <w:r>
@@ -3288,6 +3434,7 @@
           </w:tcPr>
           <w:p>
             <w:pPr>
+              <w:keepNext/>
               <w:spacing w:after="0" w:line="240" w:lineRule="auto"/>
             </w:pPr>
             <w:r>
@@ -3417,6 +3564,7 @@
           </w:tcPr>
           <w:p>
             <w:pPr>
+              <w:keepNext/>
               <w:jc w:val="center"/>
             </w:pPr>
             <w:r>
@@ -3444,6 +3592,7 @@
           </w:tcPr>
           <w:p>
             <w:pPr>
+              <w:keepNext/>
               <w:jc w:val="center"/>
             </w:pPr>
             <w:r>
@@ -3475,6 +3624,7 @@
           </w:tcPr>
           <w:p>
             <w:pPr>
+              <w:keepNext/>
               <w:spacing w:after="0" w:line="240" w:lineRule="auto"/>
             </w:pPr>
             <w:r>
@@ -3500,15 +3650,16 @@
           </w:tcPr>
           <w:p>
             <w:pPr>
-              <w:spacing w:after="0" w:line="240" w:lineRule="auto"/>
-            </w:pPr>
-            <w:r>
-              <w:rPr>
-                <w:rFonts w:ascii="Malgun Gothic" w:hAnsi="Malgun Gothic" w:eastAsia="Malgun Gothic"/>
-                <w:color w:val="1F2937"/>
-                <w:sz w:val="16"/>
-              </w:rPr>
-              <w:t>REQ-FUNC-011; REQ-DATA-001~013; REQ-ERR-001~002</w:t>
+              <w:keepNext/>
+              <w:spacing w:after="0" w:line="240" w:lineRule="auto"/>
+            </w:pPr>
+            <w:r>
+              <w:rPr>
+                <w:rFonts w:ascii="Malgun Gothic" w:hAnsi="Malgun Gothic" w:eastAsia="Malgun Gothic"/>
+                <w:color w:val="1F2937"/>
+                <w:sz w:val="16"/>
+              </w:rPr>
+              <w:t>REQ-FUNC-011, REQ-FUNC-026; REQ-DATA-001~013; REQ-IF-011; REQ-ERR-001; REQ-SEC-001</w:t>
             </w:r>
           </w:p>
         </w:tc>
@@ -3530,6 +3681,7 @@
           </w:tcPr>
           <w:p>
             <w:pPr>
+              <w:keepNext/>
               <w:spacing w:after="0" w:line="240" w:lineRule="auto"/>
             </w:pPr>
             <w:r>
@@ -3555,6 +3707,7 @@
           </w:tcPr>
           <w:p>
             <w:pPr>
+              <w:keepNext/>
               <w:spacing w:after="0" w:line="240" w:lineRule="auto"/>
             </w:pPr>
             <w:r>
@@ -3585,6 +3738,7 @@
           </w:tcPr>
           <w:p>
             <w:pPr>
+              <w:keepNext/>
               <w:spacing w:after="0" w:line="240" w:lineRule="auto"/>
             </w:pPr>
             <w:r>
@@ -3610,6 +3764,7 @@
           </w:tcPr>
           <w:p>
             <w:pPr>
+              <w:keepNext/>
               <w:spacing w:after="0" w:line="240" w:lineRule="auto"/>
             </w:pPr>
             <w:r>
@@ -3640,6 +3795,7 @@
           </w:tcPr>
           <w:p>
             <w:pPr>
+              <w:keepNext/>
               <w:spacing w:after="0" w:line="240" w:lineRule="auto"/>
             </w:pPr>
             <w:r>
@@ -3665,6 +3821,7 @@
           </w:tcPr>
           <w:p>
             <w:pPr>
+              <w:keepNext/>
               <w:spacing w:after="0" w:line="240" w:lineRule="auto"/>
             </w:pPr>
             <w:r>
@@ -3695,6 +3852,7 @@
           </w:tcPr>
           <w:p>
             <w:pPr>
+              <w:keepNext/>
               <w:spacing w:after="0" w:line="240" w:lineRule="auto"/>
             </w:pPr>
             <w:r>
@@ -3720,6 +3878,7 @@
           </w:tcPr>
           <w:p>
             <w:pPr>
+              <w:keepNext/>
               <w:spacing w:after="0" w:line="240" w:lineRule="auto"/>
             </w:pPr>
             <w:r>
@@ -3758,6 +3917,7 @@
           </w:tcPr>
           <w:p>
             <w:pPr>
+              <w:keepNext/>
               <w:spacing w:after="0" w:line="240" w:lineRule="auto"/>
             </w:pPr>
             <w:r>
@@ -3783,6 +3943,7 @@
           </w:tcPr>
           <w:p>
             <w:pPr>
+              <w:keepNext/>
               <w:spacing w:after="0" w:line="240" w:lineRule="auto"/>
             </w:pPr>
             <w:r>
@@ -3912,6 +4073,7 @@
           </w:tcPr>
           <w:p>
             <w:pPr>
+              <w:keepNext/>
               <w:jc w:val="center"/>
             </w:pPr>
             <w:r>
@@ -3939,6 +4101,7 @@
           </w:tcPr>
           <w:p>
             <w:pPr>
+              <w:keepNext/>
               <w:jc w:val="center"/>
             </w:pPr>
             <w:r>
@@ -3970,6 +4133,7 @@
           </w:tcPr>
           <w:p>
             <w:pPr>
+              <w:keepNext/>
               <w:spacing w:after="0" w:line="240" w:lineRule="auto"/>
             </w:pPr>
             <w:r>
@@ -3995,15 +4159,16 @@
           </w:tcPr>
           <w:p>
             <w:pPr>
-              <w:spacing w:after="0" w:line="240" w:lineRule="auto"/>
-            </w:pPr>
-            <w:r>
-              <w:rPr>
-                <w:rFonts w:ascii="Malgun Gothic" w:hAnsi="Malgun Gothic" w:eastAsia="Malgun Gothic"/>
-                <w:color w:val="1F2937"/>
-                <w:sz w:val="16"/>
-              </w:rPr>
-              <w:t>REQ-FUNC-011~013; REQ-PERF-005</w:t>
+              <w:keepNext/>
+              <w:spacing w:after="0" w:line="240" w:lineRule="auto"/>
+            </w:pPr>
+            <w:r>
+              <w:rPr>
+                <w:rFonts w:ascii="Malgun Gothic" w:hAnsi="Malgun Gothic" w:eastAsia="Malgun Gothic"/>
+                <w:color w:val="1F2937"/>
+                <w:sz w:val="16"/>
+              </w:rPr>
+              <w:t>REQ-FUNC-011~013; REQ-ERR-002; REQ-PERF-005</w:t>
             </w:r>
           </w:p>
         </w:tc>
@@ -4025,6 +4190,7 @@
           </w:tcPr>
           <w:p>
             <w:pPr>
+              <w:keepNext/>
               <w:spacing w:after="0" w:line="240" w:lineRule="auto"/>
             </w:pPr>
             <w:r>
@@ -4050,6 +4216,7 @@
           </w:tcPr>
           <w:p>
             <w:pPr>
+              <w:keepNext/>
               <w:spacing w:after="0" w:line="240" w:lineRule="auto"/>
             </w:pPr>
             <w:r>
@@ -4080,6 +4247,7 @@
           </w:tcPr>
           <w:p>
             <w:pPr>
+              <w:keepNext/>
               <w:spacing w:after="0" w:line="240" w:lineRule="auto"/>
             </w:pPr>
             <w:r>
@@ -4105,6 +4273,7 @@
           </w:tcPr>
           <w:p>
             <w:pPr>
+              <w:keepNext/>
               <w:spacing w:after="0" w:line="240" w:lineRule="auto"/>
             </w:pPr>
             <w:r>
@@ -4135,6 +4304,7 @@
           </w:tcPr>
           <w:p>
             <w:pPr>
+              <w:keepNext/>
               <w:spacing w:after="0" w:line="240" w:lineRule="auto"/>
             </w:pPr>
             <w:r>
@@ -4160,6 +4330,7 @@
           </w:tcPr>
           <w:p>
             <w:pPr>
+              <w:keepNext/>
               <w:spacing w:after="0" w:line="240" w:lineRule="auto"/>
             </w:pPr>
             <w:r>
@@ -4190,6 +4361,7 @@
           </w:tcPr>
           <w:p>
             <w:pPr>
+              <w:keepNext/>
               <w:spacing w:after="0" w:line="240" w:lineRule="auto"/>
             </w:pPr>
             <w:r>
@@ -4215,6 +4387,7 @@
           </w:tcPr>
           <w:p>
             <w:pPr>
+              <w:keepNext/>
               <w:spacing w:after="0" w:line="240" w:lineRule="auto"/>
             </w:pPr>
             <w:r>
@@ -4253,6 +4426,7 @@
           </w:tcPr>
           <w:p>
             <w:pPr>
+              <w:keepNext/>
               <w:spacing w:after="0" w:line="240" w:lineRule="auto"/>
             </w:pPr>
             <w:r>
@@ -4278,6 +4452,7 @@
           </w:tcPr>
           <w:p>
             <w:pPr>
+              <w:keepNext/>
               <w:spacing w:after="0" w:line="240" w:lineRule="auto"/>
             </w:pPr>
             <w:r>
@@ -4407,6 +4582,7 @@
           </w:tcPr>
           <w:p>
             <w:pPr>
+              <w:keepNext/>
               <w:jc w:val="center"/>
             </w:pPr>
             <w:r>
@@ -4434,6 +4610,7 @@
           </w:tcPr>
           <w:p>
             <w:pPr>
+              <w:keepNext/>
               <w:jc w:val="center"/>
             </w:pPr>
             <w:r>
@@ -4465,6 +4642,7 @@
           </w:tcPr>
           <w:p>
             <w:pPr>
+              <w:keepNext/>
               <w:spacing w:after="0" w:line="240" w:lineRule="auto"/>
             </w:pPr>
             <w:r>
@@ -4490,15 +4668,16 @@
           </w:tcPr>
           <w:p>
             <w:pPr>
-              <w:spacing w:after="0" w:line="240" w:lineRule="auto"/>
-            </w:pPr>
-            <w:r>
-              <w:rPr>
-                <w:rFonts w:ascii="Malgun Gothic" w:hAnsi="Malgun Gothic" w:eastAsia="Malgun Gothic"/>
-                <w:color w:val="1F2937"/>
-                <w:sz w:val="16"/>
-              </w:rPr>
-              <w:t>REQ-FUNC-002~004; REQ-COM-002~004</w:t>
+              <w:keepNext/>
+              <w:spacing w:after="0" w:line="240" w:lineRule="auto"/>
+            </w:pPr>
+            <w:r>
+              <w:rPr>
+                <w:rFonts w:ascii="Malgun Gothic" w:hAnsi="Malgun Gothic" w:eastAsia="Malgun Gothic"/>
+                <w:color w:val="1F2937"/>
+                <w:sz w:val="16"/>
+              </w:rPr>
+              <w:t>REQ-FUNC-002, REQ-FUNC-004; REQ-IF-004; REQ-ERR-008; REQ-PERF-003; REQ-DIAG-004</w:t>
             </w:r>
           </w:p>
         </w:tc>
@@ -4520,6 +4699,7 @@
           </w:tcPr>
           <w:p>
             <w:pPr>
+              <w:keepNext/>
               <w:spacing w:after="0" w:line="240" w:lineRule="auto"/>
             </w:pPr>
             <w:r>
@@ -4545,6 +4725,7 @@
           </w:tcPr>
           <w:p>
             <w:pPr>
+              <w:keepNext/>
               <w:spacing w:after="0" w:line="240" w:lineRule="auto"/>
             </w:pPr>
             <w:r>
@@ -4575,6 +4756,7 @@
           </w:tcPr>
           <w:p>
             <w:pPr>
+              <w:keepNext/>
               <w:spacing w:after="0" w:line="240" w:lineRule="auto"/>
             </w:pPr>
             <w:r>
@@ -4600,6 +4782,7 @@
           </w:tcPr>
           <w:p>
             <w:pPr>
+              <w:keepNext/>
               <w:spacing w:after="0" w:line="240" w:lineRule="auto"/>
             </w:pPr>
             <w:r>
@@ -4630,6 +4813,7 @@
           </w:tcPr>
           <w:p>
             <w:pPr>
+              <w:keepNext/>
               <w:spacing w:after="0" w:line="240" w:lineRule="auto"/>
             </w:pPr>
             <w:r>
@@ -4655,6 +4839,7 @@
           </w:tcPr>
           <w:p>
             <w:pPr>
+              <w:keepNext/>
               <w:spacing w:after="0" w:line="240" w:lineRule="auto"/>
             </w:pPr>
             <w:r>
@@ -4685,6 +4870,7 @@
           </w:tcPr>
           <w:p>
             <w:pPr>
+              <w:keepNext/>
               <w:spacing w:after="0" w:line="240" w:lineRule="auto"/>
             </w:pPr>
             <w:r>
@@ -4710,6 +4896,7 @@
           </w:tcPr>
           <w:p>
             <w:pPr>
+              <w:keepNext/>
               <w:spacing w:after="0" w:line="240" w:lineRule="auto"/>
             </w:pPr>
             <w:r>
@@ -4746,6 +4933,7 @@
           </w:tcPr>
           <w:p>
             <w:pPr>
+              <w:keepNext/>
               <w:spacing w:after="0" w:line="240" w:lineRule="auto"/>
             </w:pPr>
             <w:r>
@@ -4771,6 +4959,7 @@
           </w:tcPr>
           <w:p>
             <w:pPr>
+              <w:keepNext/>
               <w:spacing w:after="0" w:line="240" w:lineRule="auto"/>
             </w:pPr>
             <w:r>
@@ -4900,6 +5089,7 @@
           </w:tcPr>
           <w:p>
             <w:pPr>
+              <w:keepNext/>
               <w:jc w:val="center"/>
             </w:pPr>
             <w:r>
@@ -4927,6 +5117,7 @@
           </w:tcPr>
           <w:p>
             <w:pPr>
+              <w:keepNext/>
               <w:jc w:val="center"/>
             </w:pPr>
             <w:r>
@@ -4958,6 +5149,7 @@
           </w:tcPr>
           <w:p>
             <w:pPr>
+              <w:keepNext/>
               <w:spacing w:after="0" w:line="240" w:lineRule="auto"/>
             </w:pPr>
             <w:r>
@@ -4983,15 +5175,16 @@
           </w:tcPr>
           <w:p>
             <w:pPr>
-              <w:spacing w:after="0" w:line="240" w:lineRule="auto"/>
-            </w:pPr>
-            <w:r>
-              <w:rPr>
-                <w:rFonts w:ascii="Malgun Gothic" w:hAnsi="Malgun Gothic" w:eastAsia="Malgun Gothic"/>
-                <w:color w:val="1F2937"/>
-                <w:sz w:val="16"/>
-              </w:rPr>
-              <w:t>REQ-FUNC-002,REQ-FUNC-005</w:t>
+              <w:keepNext/>
+              <w:spacing w:after="0" w:line="240" w:lineRule="auto"/>
+            </w:pPr>
+            <w:r>
+              <w:rPr>
+                <w:rFonts w:ascii="Malgun Gothic" w:hAnsi="Malgun Gothic" w:eastAsia="Malgun Gothic"/>
+                <w:color w:val="1F2937"/>
+                <w:sz w:val="16"/>
+              </w:rPr>
+              <w:t>REQ-FUNC-002, REQ-FUNC-005; REQ-IF-004; REQ-PERF-003</w:t>
             </w:r>
           </w:p>
         </w:tc>
@@ -5013,6 +5206,7 @@
           </w:tcPr>
           <w:p>
             <w:pPr>
+              <w:keepNext/>
               <w:spacing w:after="0" w:line="240" w:lineRule="auto"/>
             </w:pPr>
             <w:r>
@@ -5038,6 +5232,7 @@
           </w:tcPr>
           <w:p>
             <w:pPr>
+              <w:keepNext/>
               <w:spacing w:after="0" w:line="240" w:lineRule="auto"/>
             </w:pPr>
             <w:r>
@@ -5068,6 +5263,7 @@
           </w:tcPr>
           <w:p>
             <w:pPr>
+              <w:keepNext/>
               <w:spacing w:after="0" w:line="240" w:lineRule="auto"/>
             </w:pPr>
             <w:r>
@@ -5093,6 +5289,7 @@
           </w:tcPr>
           <w:p>
             <w:pPr>
+              <w:keepNext/>
               <w:spacing w:after="0" w:line="240" w:lineRule="auto"/>
             </w:pPr>
             <w:r>
@@ -5123,6 +5320,7 @@
           </w:tcPr>
           <w:p>
             <w:pPr>
+              <w:keepNext/>
               <w:spacing w:after="0" w:line="240" w:lineRule="auto"/>
             </w:pPr>
             <w:r>
@@ -5148,6 +5346,7 @@
           </w:tcPr>
           <w:p>
             <w:pPr>
+              <w:keepNext/>
               <w:spacing w:after="0" w:line="240" w:lineRule="auto"/>
             </w:pPr>
             <w:r>
@@ -5178,6 +5377,7 @@
           </w:tcPr>
           <w:p>
             <w:pPr>
+              <w:keepNext/>
               <w:spacing w:after="0" w:line="240" w:lineRule="auto"/>
             </w:pPr>
             <w:r>
@@ -5203,6 +5403,7 @@
           </w:tcPr>
           <w:p>
             <w:pPr>
+              <w:keepNext/>
               <w:spacing w:after="0" w:line="240" w:lineRule="auto"/>
             </w:pPr>
             <w:r>
@@ -5239,6 +5440,7 @@
           </w:tcPr>
           <w:p>
             <w:pPr>
+              <w:keepNext/>
               <w:spacing w:after="0" w:line="240" w:lineRule="auto"/>
             </w:pPr>
             <w:r>
@@ -5264,6 +5466,7 @@
           </w:tcPr>
           <w:p>
             <w:pPr>
+              <w:keepNext/>
               <w:spacing w:after="0" w:line="240" w:lineRule="auto"/>
             </w:pPr>
             <w:r>
@@ -5393,6 +5596,7 @@
           </w:tcPr>
           <w:p>
             <w:pPr>
+              <w:keepNext/>
               <w:jc w:val="center"/>
             </w:pPr>
             <w:r>
@@ -5420,6 +5624,7 @@
           </w:tcPr>
           <w:p>
             <w:pPr>
+              <w:keepNext/>
               <w:jc w:val="center"/>
             </w:pPr>
             <w:r>
@@ -5451,6 +5656,7 @@
           </w:tcPr>
           <w:p>
             <w:pPr>
+              <w:keepNext/>
               <w:spacing w:after="0" w:line="240" w:lineRule="auto"/>
             </w:pPr>
             <w:r>
@@ -5476,15 +5682,16 @@
           </w:tcPr>
           <w:p>
             <w:pPr>
-              <w:spacing w:after="0" w:line="240" w:lineRule="auto"/>
-            </w:pPr>
-            <w:r>
-              <w:rPr>
-                <w:rFonts w:ascii="Malgun Gothic" w:hAnsi="Malgun Gothic" w:eastAsia="Malgun Gothic"/>
-                <w:color w:val="1F2937"/>
-                <w:sz w:val="16"/>
-              </w:rPr>
-              <w:t>REQ-FUNC-002~003; REQ-IF-005,REQ-IF-008</w:t>
+              <w:keepNext/>
+              <w:spacing w:after="0" w:line="240" w:lineRule="auto"/>
+            </w:pPr>
+            <w:r>
+              <w:rPr>
+                <w:rFonts w:ascii="Malgun Gothic" w:hAnsi="Malgun Gothic" w:eastAsia="Malgun Gothic"/>
+                <w:color w:val="1F2937"/>
+                <w:sz w:val="16"/>
+              </w:rPr>
+              <w:t>REQ-FUNC-002~003; REQ-IF-004~005, REQ-IF-008; REQ-PERF-003</w:t>
             </w:r>
           </w:p>
         </w:tc>
@@ -5506,6 +5713,7 @@
           </w:tcPr>
           <w:p>
             <w:pPr>
+              <w:keepNext/>
               <w:spacing w:after="0" w:line="240" w:lineRule="auto"/>
             </w:pPr>
             <w:r>
@@ -5531,6 +5739,7 @@
           </w:tcPr>
           <w:p>
             <w:pPr>
+              <w:keepNext/>
               <w:spacing w:after="0" w:line="240" w:lineRule="auto"/>
             </w:pPr>
             <w:r>
@@ -5561,6 +5770,7 @@
           </w:tcPr>
           <w:p>
             <w:pPr>
+              <w:keepNext/>
               <w:spacing w:after="0" w:line="240" w:lineRule="auto"/>
             </w:pPr>
             <w:r>
@@ -5586,6 +5796,7 @@
           </w:tcPr>
           <w:p>
             <w:pPr>
+              <w:keepNext/>
               <w:spacing w:after="0" w:line="240" w:lineRule="auto"/>
             </w:pPr>
             <w:r>
@@ -5616,6 +5827,7 @@
           </w:tcPr>
           <w:p>
             <w:pPr>
+              <w:keepNext/>
               <w:spacing w:after="0" w:line="240" w:lineRule="auto"/>
             </w:pPr>
             <w:r>
@@ -5641,6 +5853,7 @@
           </w:tcPr>
           <w:p>
             <w:pPr>
+              <w:keepNext/>
               <w:spacing w:after="0" w:line="240" w:lineRule="auto"/>
             </w:pPr>
             <w:r>
@@ -5671,6 +5884,7 @@
           </w:tcPr>
           <w:p>
             <w:pPr>
+              <w:keepNext/>
               <w:spacing w:after="0" w:line="240" w:lineRule="auto"/>
             </w:pPr>
             <w:r>
@@ -5696,6 +5910,7 @@
           </w:tcPr>
           <w:p>
             <w:pPr>
+              <w:keepNext/>
               <w:spacing w:after="0" w:line="240" w:lineRule="auto"/>
             </w:pPr>
             <w:r>
@@ -5730,6 +5945,7 @@
           </w:tcPr>
           <w:p>
             <w:pPr>
+              <w:keepNext/>
               <w:spacing w:after="0" w:line="240" w:lineRule="auto"/>
             </w:pPr>
             <w:r>
@@ -5755,6 +5971,7 @@
           </w:tcPr>
           <w:p>
             <w:pPr>
+              <w:keepNext/>
               <w:spacing w:after="0" w:line="240" w:lineRule="auto"/>
             </w:pPr>
             <w:r>
@@ -5884,6 +6101,7 @@
           </w:tcPr>
           <w:p>
             <w:pPr>
+              <w:keepNext/>
               <w:jc w:val="center"/>
             </w:pPr>
             <w:r>
@@ -5911,6 +6129,7 @@
           </w:tcPr>
           <w:p>
             <w:pPr>
+              <w:keepNext/>
               <w:jc w:val="center"/>
             </w:pPr>
             <w:r>
@@ -5942,6 +6161,7 @@
           </w:tcPr>
           <w:p>
             <w:pPr>
+              <w:keepNext/>
               <w:spacing w:after="0" w:line="240" w:lineRule="auto"/>
             </w:pPr>
             <w:r>
@@ -5967,15 +6187,16 @@
           </w:tcPr>
           <w:p>
             <w:pPr>
-              <w:spacing w:after="0" w:line="240" w:lineRule="auto"/>
-            </w:pPr>
-            <w:r>
-              <w:rPr>
-                <w:rFonts w:ascii="Malgun Gothic" w:hAnsi="Malgun Gothic" w:eastAsia="Malgun Gothic"/>
-                <w:color w:val="1F2937"/>
-                <w:sz w:val="16"/>
-              </w:rPr>
-              <w:t>REQ-FUNC-006~007; REQ-ERR-008</w:t>
+              <w:keepNext/>
+              <w:spacing w:after="0" w:line="240" w:lineRule="auto"/>
+            </w:pPr>
+            <w:r>
+              <w:rPr>
+                <w:rFonts w:ascii="Malgun Gothic" w:hAnsi="Malgun Gothic" w:eastAsia="Malgun Gothic"/>
+                <w:color w:val="1F2937"/>
+                <w:sz w:val="16"/>
+              </w:rPr>
+              <w:t>REQ-FUNC-006~007; REQ-IF-004; REQ-ERR-008; REQ-DIAG-004</w:t>
             </w:r>
           </w:p>
         </w:tc>
@@ -5997,6 +6218,7 @@
           </w:tcPr>
           <w:p>
             <w:pPr>
+              <w:keepNext/>
               <w:spacing w:after="0" w:line="240" w:lineRule="auto"/>
             </w:pPr>
             <w:r>
@@ -6022,6 +6244,7 @@
           </w:tcPr>
           <w:p>
             <w:pPr>
+              <w:keepNext/>
               <w:spacing w:after="0" w:line="240" w:lineRule="auto"/>
             </w:pPr>
             <w:r>
@@ -6052,6 +6275,7 @@
           </w:tcPr>
           <w:p>
             <w:pPr>
+              <w:keepNext/>
               <w:spacing w:after="0" w:line="240" w:lineRule="auto"/>
             </w:pPr>
             <w:r>
@@ -6077,6 +6301,7 @@
           </w:tcPr>
           <w:p>
             <w:pPr>
+              <w:keepNext/>
               <w:spacing w:after="0" w:line="240" w:lineRule="auto"/>
             </w:pPr>
             <w:r>
@@ -6107,6 +6332,7 @@
           </w:tcPr>
           <w:p>
             <w:pPr>
+              <w:keepNext/>
               <w:spacing w:after="0" w:line="240" w:lineRule="auto"/>
             </w:pPr>
             <w:r>
@@ -6132,6 +6358,7 @@
           </w:tcPr>
           <w:p>
             <w:pPr>
+              <w:keepNext/>
               <w:spacing w:after="0" w:line="240" w:lineRule="auto"/>
             </w:pPr>
             <w:r>
@@ -6162,6 +6389,7 @@
           </w:tcPr>
           <w:p>
             <w:pPr>
+              <w:keepNext/>
               <w:spacing w:after="0" w:line="240" w:lineRule="auto"/>
             </w:pPr>
             <w:r>
@@ -6187,6 +6415,7 @@
           </w:tcPr>
           <w:p>
             <w:pPr>
+              <w:keepNext/>
               <w:spacing w:after="0" w:line="240" w:lineRule="auto"/>
             </w:pPr>
             <w:r>
@@ -6225,6 +6454,7 @@
           </w:tcPr>
           <w:p>
             <w:pPr>
+              <w:keepNext/>
               <w:spacing w:after="0" w:line="240" w:lineRule="auto"/>
             </w:pPr>
             <w:r>
@@ -6250,6 +6480,7 @@
           </w:tcPr>
           <w:p>
             <w:pPr>
+              <w:keepNext/>
               <w:spacing w:after="0" w:line="240" w:lineRule="auto"/>
             </w:pPr>
             <w:r>
@@ -6387,6 +6618,7 @@
           </w:tcPr>
           <w:p>
             <w:pPr>
+              <w:keepNext/>
               <w:jc w:val="center"/>
             </w:pPr>
             <w:r>
@@ -6414,6 +6646,7 @@
           </w:tcPr>
           <w:p>
             <w:pPr>
+              <w:keepNext/>
               <w:jc w:val="center"/>
             </w:pPr>
             <w:r>
@@ -6445,6 +6678,7 @@
           </w:tcPr>
           <w:p>
             <w:pPr>
+              <w:keepNext/>
               <w:spacing w:after="0" w:line="240" w:lineRule="auto"/>
             </w:pPr>
             <w:r>
@@ -6470,15 +6704,16 @@
           </w:tcPr>
           <w:p>
             <w:pPr>
-              <w:spacing w:after="0" w:line="240" w:lineRule="auto"/>
-            </w:pPr>
-            <w:r>
-              <w:rPr>
-                <w:rFonts w:ascii="Malgun Gothic" w:hAnsi="Malgun Gothic" w:eastAsia="Malgun Gothic"/>
-                <w:color w:val="1F2937"/>
-                <w:sz w:val="16"/>
-              </w:rPr>
-              <w:t>REQ-COM-001~005</w:t>
+              <w:keepNext/>
+              <w:spacing w:after="0" w:line="240" w:lineRule="auto"/>
+            </w:pPr>
+            <w:r>
+              <w:rPr>
+                <w:rFonts w:ascii="Malgun Gothic" w:hAnsi="Malgun Gothic" w:eastAsia="Malgun Gothic"/>
+                <w:color w:val="1F2937"/>
+                <w:sz w:val="16"/>
+              </w:rPr>
+              <w:t>REQ-COM-001~005; REQ-IF-010</w:t>
             </w:r>
           </w:p>
         </w:tc>
@@ -6500,6 +6735,7 @@
           </w:tcPr>
           <w:p>
             <w:pPr>
+              <w:keepNext/>
               <w:spacing w:after="0" w:line="240" w:lineRule="auto"/>
             </w:pPr>
             <w:r>
@@ -6525,6 +6761,7 @@
           </w:tcPr>
           <w:p>
             <w:pPr>
+              <w:keepNext/>
               <w:spacing w:after="0" w:line="240" w:lineRule="auto"/>
             </w:pPr>
             <w:r>
@@ -6555,6 +6792,7 @@
           </w:tcPr>
           <w:p>
             <w:pPr>
+              <w:keepNext/>
               <w:spacing w:after="0" w:line="240" w:lineRule="auto"/>
             </w:pPr>
             <w:r>
@@ -6580,6 +6818,7 @@
           </w:tcPr>
           <w:p>
             <w:pPr>
+              <w:keepNext/>
               <w:spacing w:after="0" w:line="240" w:lineRule="auto"/>
             </w:pPr>
             <w:r>
@@ -6610,6 +6849,7 @@
           </w:tcPr>
           <w:p>
             <w:pPr>
+              <w:keepNext/>
               <w:spacing w:after="0" w:line="240" w:lineRule="auto"/>
             </w:pPr>
             <w:r>
@@ -6635,6 +6875,7 @@
           </w:tcPr>
           <w:p>
             <w:pPr>
+              <w:keepNext/>
               <w:spacing w:after="0" w:line="240" w:lineRule="auto"/>
             </w:pPr>
             <w:r>
@@ -6665,6 +6906,7 @@
           </w:tcPr>
           <w:p>
             <w:pPr>
+              <w:keepNext/>
               <w:spacing w:after="0" w:line="240" w:lineRule="auto"/>
             </w:pPr>
             <w:r>
@@ -6690,6 +6932,7 @@
           </w:tcPr>
           <w:p>
             <w:pPr>
+              <w:keepNext/>
               <w:spacing w:after="0" w:line="240" w:lineRule="auto"/>
             </w:pPr>
             <w:r>
@@ -6726,6 +6969,7 @@
           </w:tcPr>
           <w:p>
             <w:pPr>
+              <w:keepNext/>
               <w:spacing w:after="0" w:line="240" w:lineRule="auto"/>
             </w:pPr>
             <w:r>
@@ -6751,6 +6995,7 @@
           </w:tcPr>
           <w:p>
             <w:pPr>
+              <w:keepNext/>
               <w:spacing w:after="0" w:line="240" w:lineRule="auto"/>
             </w:pPr>
             <w:r>
@@ -6880,6 +7125,7 @@
           </w:tcPr>
           <w:p>
             <w:pPr>
+              <w:keepNext/>
               <w:jc w:val="center"/>
             </w:pPr>
             <w:r>
@@ -6907,6 +7153,7 @@
           </w:tcPr>
           <w:p>
             <w:pPr>
+              <w:keepNext/>
               <w:jc w:val="center"/>
             </w:pPr>
             <w:r>
@@ -6938,6 +7185,7 @@
           </w:tcPr>
           <w:p>
             <w:pPr>
+              <w:keepNext/>
               <w:spacing w:after="0" w:line="240" w:lineRule="auto"/>
             </w:pPr>
             <w:r>
@@ -6963,15 +7211,16 @@
           </w:tcPr>
           <w:p>
             <w:pPr>
-              <w:spacing w:after="0" w:line="240" w:lineRule="auto"/>
-            </w:pPr>
-            <w:r>
-              <w:rPr>
-                <w:rFonts w:ascii="Malgun Gothic" w:hAnsi="Malgun Gothic" w:eastAsia="Malgun Gothic"/>
-                <w:color w:val="1F2937"/>
-                <w:sz w:val="16"/>
-              </w:rPr>
-              <w:t>REQ-COM-012~013; REQ-REL-001</w:t>
+              <w:keepNext/>
+              <w:spacing w:after="0" w:line="240" w:lineRule="auto"/>
+            </w:pPr>
+            <w:r>
+              <w:rPr>
+                <w:rFonts w:ascii="Malgun Gothic" w:hAnsi="Malgun Gothic" w:eastAsia="Malgun Gothic"/>
+                <w:color w:val="1F2937"/>
+                <w:sz w:val="16"/>
+              </w:rPr>
+              <w:t>REQ-COM-012~013; REQ-REL-001; REQ-COMP-005</w:t>
             </w:r>
           </w:p>
         </w:tc>
@@ -6993,6 +7242,7 @@
           </w:tcPr>
           <w:p>
             <w:pPr>
+              <w:keepNext/>
               <w:spacing w:after="0" w:line="240" w:lineRule="auto"/>
             </w:pPr>
             <w:r>
@@ -7018,6 +7268,7 @@
           </w:tcPr>
           <w:p>
             <w:pPr>
+              <w:keepNext/>
               <w:spacing w:after="0" w:line="240" w:lineRule="auto"/>
             </w:pPr>
             <w:r>
@@ -7048,6 +7299,7 @@
           </w:tcPr>
           <w:p>
             <w:pPr>
+              <w:keepNext/>
               <w:spacing w:after="0" w:line="240" w:lineRule="auto"/>
             </w:pPr>
             <w:r>
@@ -7073,6 +7325,7 @@
           </w:tcPr>
           <w:p>
             <w:pPr>
+              <w:keepNext/>
               <w:spacing w:after="0" w:line="240" w:lineRule="auto"/>
             </w:pPr>
             <w:r>
@@ -7103,6 +7356,7 @@
           </w:tcPr>
           <w:p>
             <w:pPr>
+              <w:keepNext/>
               <w:spacing w:after="0" w:line="240" w:lineRule="auto"/>
             </w:pPr>
             <w:r>
@@ -7128,6 +7382,7 @@
           </w:tcPr>
           <w:p>
             <w:pPr>
+              <w:keepNext/>
               <w:spacing w:after="0" w:line="240" w:lineRule="auto"/>
             </w:pPr>
             <w:r>
@@ -7158,6 +7413,7 @@
           </w:tcPr>
           <w:p>
             <w:pPr>
+              <w:keepNext/>
               <w:spacing w:after="0" w:line="240" w:lineRule="auto"/>
             </w:pPr>
             <w:r>
@@ -7183,6 +7439,7 @@
           </w:tcPr>
           <w:p>
             <w:pPr>
+              <w:keepNext/>
               <w:spacing w:after="0" w:line="240" w:lineRule="auto"/>
             </w:pPr>
             <w:r>
@@ -7221,6 +7478,7 @@
           </w:tcPr>
           <w:p>
             <w:pPr>
+              <w:keepNext/>
               <w:spacing w:after="0" w:line="240" w:lineRule="auto"/>
             </w:pPr>
             <w:r>
@@ -7246,6 +7504,7 @@
           </w:tcPr>
           <w:p>
             <w:pPr>
+              <w:keepNext/>
               <w:spacing w:after="0" w:line="240" w:lineRule="auto"/>
             </w:pPr>
             <w:r>
@@ -7375,6 +7634,7 @@
           </w:tcPr>
           <w:p>
             <w:pPr>
+              <w:keepNext/>
               <w:jc w:val="center"/>
             </w:pPr>
             <w:r>
@@ -7402,6 +7662,7 @@
           </w:tcPr>
           <w:p>
             <w:pPr>
+              <w:keepNext/>
               <w:jc w:val="center"/>
             </w:pPr>
             <w:r>
@@ -7433,6 +7694,7 @@
           </w:tcPr>
           <w:p>
             <w:pPr>
+              <w:keepNext/>
               <w:spacing w:after="0" w:line="240" w:lineRule="auto"/>
             </w:pPr>
             <w:r>
@@ -7458,15 +7720,16 @@
           </w:tcPr>
           <w:p>
             <w:pPr>
-              <w:spacing w:after="0" w:line="240" w:lineRule="auto"/>
-            </w:pPr>
-            <w:r>
-              <w:rPr>
-                <w:rFonts w:ascii="Malgun Gothic" w:hAnsi="Malgun Gothic" w:eastAsia="Malgun Gothic"/>
-                <w:color w:val="1F2937"/>
-                <w:sz w:val="16"/>
-              </w:rPr>
-              <w:t>REQ-COM-011,REQ-COM-014; REQ-DIAG-005</w:t>
+              <w:keepNext/>
+              <w:spacing w:after="0" w:line="240" w:lineRule="auto"/>
+            </w:pPr>
+            <w:r>
+              <w:rPr>
+                <w:rFonts w:ascii="Malgun Gothic" w:hAnsi="Malgun Gothic" w:eastAsia="Malgun Gothic"/>
+                <w:color w:val="1F2937"/>
+                <w:sz w:val="16"/>
+              </w:rPr>
+              <w:t>REQ-COM-011, REQ-COM-014; REQ-DIAG-005; REQ-COMP-005</w:t>
             </w:r>
           </w:p>
         </w:tc>
@@ -7488,6 +7751,7 @@
           </w:tcPr>
           <w:p>
             <w:pPr>
+              <w:keepNext/>
               <w:spacing w:after="0" w:line="240" w:lineRule="auto"/>
             </w:pPr>
             <w:r>
@@ -7513,6 +7777,7 @@
           </w:tcPr>
           <w:p>
             <w:pPr>
+              <w:keepNext/>
               <w:spacing w:after="0" w:line="240" w:lineRule="auto"/>
             </w:pPr>
             <w:r>
@@ -7543,6 +7808,7 @@
           </w:tcPr>
           <w:p>
             <w:pPr>
+              <w:keepNext/>
               <w:spacing w:after="0" w:line="240" w:lineRule="auto"/>
             </w:pPr>
             <w:r>
@@ -7568,6 +7834,7 @@
           </w:tcPr>
           <w:p>
             <w:pPr>
+              <w:keepNext/>
               <w:spacing w:after="0" w:line="240" w:lineRule="auto"/>
             </w:pPr>
             <w:r>
@@ -7598,6 +7865,7 @@
           </w:tcPr>
           <w:p>
             <w:pPr>
+              <w:keepNext/>
               <w:spacing w:after="0" w:line="240" w:lineRule="auto"/>
             </w:pPr>
             <w:r>
@@ -7623,6 +7891,7 @@
           </w:tcPr>
           <w:p>
             <w:pPr>
+              <w:keepNext/>
               <w:spacing w:after="0" w:line="240" w:lineRule="auto"/>
             </w:pPr>
             <w:r>
@@ -7653,6 +7922,7 @@
           </w:tcPr>
           <w:p>
             <w:pPr>
+              <w:keepNext/>
               <w:spacing w:after="0" w:line="240" w:lineRule="auto"/>
             </w:pPr>
             <w:r>
@@ -7678,6 +7948,7 @@
           </w:tcPr>
           <w:p>
             <w:pPr>
+              <w:keepNext/>
               <w:spacing w:after="0" w:line="240" w:lineRule="auto"/>
             </w:pPr>
             <w:r>
@@ -7714,6 +7985,7 @@
           </w:tcPr>
           <w:p>
             <w:pPr>
+              <w:keepNext/>
               <w:spacing w:after="0" w:line="240" w:lineRule="auto"/>
             </w:pPr>
             <w:r>
@@ -7739,6 +8011,7 @@
           </w:tcPr>
           <w:p>
             <w:pPr>
+              <w:keepNext/>
               <w:spacing w:after="0" w:line="240" w:lineRule="auto"/>
             </w:pPr>
             <w:r>
@@ -7930,6 +8203,7 @@
           </w:tcPr>
           <w:p>
             <w:pPr>
+              <w:keepNext/>
               <w:jc w:val="center"/>
             </w:pPr>
             <w:r>
@@ -7957,6 +8231,7 @@
           </w:tcPr>
           <w:p>
             <w:pPr>
+              <w:keepNext/>
               <w:jc w:val="center"/>
             </w:pPr>
             <w:r>
@@ -7988,6 +8263,7 @@
           </w:tcPr>
           <w:p>
             <w:pPr>
+              <w:keepNext/>
               <w:spacing w:after="0" w:line="240" w:lineRule="auto"/>
             </w:pPr>
             <w:r>
@@ -8013,15 +8289,16 @@
           </w:tcPr>
           <w:p>
             <w:pPr>
-              <w:spacing w:after="0" w:line="240" w:lineRule="auto"/>
-            </w:pPr>
-            <w:r>
-              <w:rPr>
-                <w:rFonts w:ascii="Malgun Gothic" w:hAnsi="Malgun Gothic" w:eastAsia="Malgun Gothic"/>
-                <w:color w:val="1F2937"/>
-                <w:sz w:val="16"/>
-              </w:rPr>
-              <w:t>REQ-FUNC-014; REQ-COM-010,REQ-COM-015; REQ-SEC-002</w:t>
+              <w:keepNext/>
+              <w:spacing w:after="0" w:line="240" w:lineRule="auto"/>
+            </w:pPr>
+            <w:r>
+              <w:rPr>
+                <w:rFonts w:ascii="Malgun Gothic" w:hAnsi="Malgun Gothic" w:eastAsia="Malgun Gothic"/>
+                <w:color w:val="1F2937"/>
+                <w:sz w:val="16"/>
+              </w:rPr>
+              <w:t>REQ-COM-010, REQ-COM-015; REQ-REL-001; REQ-SEC-002</w:t>
             </w:r>
           </w:p>
         </w:tc>
@@ -8043,6 +8320,7 @@
           </w:tcPr>
           <w:p>
             <w:pPr>
+              <w:keepNext/>
               <w:spacing w:after="0" w:line="240" w:lineRule="auto"/>
             </w:pPr>
             <w:r>
@@ -8068,6 +8346,7 @@
           </w:tcPr>
           <w:p>
             <w:pPr>
+              <w:keepNext/>
               <w:spacing w:after="0" w:line="240" w:lineRule="auto"/>
             </w:pPr>
             <w:r>
@@ -8098,6 +8377,7 @@
           </w:tcPr>
           <w:p>
             <w:pPr>
+              <w:keepNext/>
               <w:spacing w:after="0" w:line="240" w:lineRule="auto"/>
             </w:pPr>
             <w:r>
@@ -8123,6 +8403,7 @@
           </w:tcPr>
           <w:p>
             <w:pPr>
+              <w:keepNext/>
               <w:spacing w:after="0" w:line="240" w:lineRule="auto"/>
             </w:pPr>
             <w:r>
@@ -8153,6 +8434,7 @@
           </w:tcPr>
           <w:p>
             <w:pPr>
+              <w:keepNext/>
               <w:spacing w:after="0" w:line="240" w:lineRule="auto"/>
             </w:pPr>
             <w:r>
@@ -8178,6 +8460,7 @@
           </w:tcPr>
           <w:p>
             <w:pPr>
+              <w:keepNext/>
               <w:spacing w:after="0" w:line="240" w:lineRule="auto"/>
             </w:pPr>
             <w:r>
@@ -8208,6 +8491,7 @@
           </w:tcPr>
           <w:p>
             <w:pPr>
+              <w:keepNext/>
               <w:spacing w:after="0" w:line="240" w:lineRule="auto"/>
             </w:pPr>
             <w:r>
@@ -8233,6 +8517,7 @@
           </w:tcPr>
           <w:p>
             <w:pPr>
+              <w:keepNext/>
               <w:spacing w:after="0" w:line="240" w:lineRule="auto"/>
             </w:pPr>
             <w:r>
@@ -8267,6 +8552,7 @@
           </w:tcPr>
           <w:p>
             <w:pPr>
+              <w:keepNext/>
               <w:spacing w:after="0" w:line="240" w:lineRule="auto"/>
             </w:pPr>
             <w:r>
@@ -8292,6 +8578,7 @@
           </w:tcPr>
           <w:p>
             <w:pPr>
+              <w:keepNext/>
               <w:spacing w:after="0" w:line="240" w:lineRule="auto"/>
             </w:pPr>
             <w:r>
@@ -8421,6 +8708,7 @@
           </w:tcPr>
           <w:p>
             <w:pPr>
+              <w:keepNext/>
               <w:jc w:val="center"/>
             </w:pPr>
             <w:r>
@@ -8448,6 +8736,7 @@
           </w:tcPr>
           <w:p>
             <w:pPr>
+              <w:keepNext/>
               <w:jc w:val="center"/>
             </w:pPr>
             <w:r>
@@ -8479,6 +8768,7 @@
           </w:tcPr>
           <w:p>
             <w:pPr>
+              <w:keepNext/>
               <w:spacing w:after="0" w:line="240" w:lineRule="auto"/>
             </w:pPr>
             <w:r>
@@ -8504,15 +8794,16 @@
           </w:tcPr>
           <w:p>
             <w:pPr>
-              <w:spacing w:after="0" w:line="240" w:lineRule="auto"/>
-            </w:pPr>
-            <w:r>
-              <w:rPr>
-                <w:rFonts w:ascii="Malgun Gothic" w:hAnsi="Malgun Gothic" w:eastAsia="Malgun Gothic"/>
-                <w:color w:val="1F2937"/>
-                <w:sz w:val="16"/>
-              </w:rPr>
-              <w:t>REQ-COM-006~008,REQ-COM-011; REQ-DATA-001</w:t>
+              <w:keepNext/>
+              <w:spacing w:after="0" w:line="240" w:lineRule="auto"/>
+            </w:pPr>
+            <w:r>
+              <w:rPr>
+                <w:rFonts w:ascii="Malgun Gothic" w:hAnsi="Malgun Gothic" w:eastAsia="Malgun Gothic"/>
+                <w:color w:val="1F2937"/>
+                <w:sz w:val="16"/>
+              </w:rPr>
+              <w:t>REQ-COM-006~008; REQ-DATA-001; REQ-PERF-001; REQ-COMP-005</w:t>
             </w:r>
           </w:p>
         </w:tc>
@@ -8534,6 +8825,7 @@
           </w:tcPr>
           <w:p>
             <w:pPr>
+              <w:keepNext/>
               <w:spacing w:after="0" w:line="240" w:lineRule="auto"/>
             </w:pPr>
             <w:r>
@@ -8559,6 +8851,7 @@
           </w:tcPr>
           <w:p>
             <w:pPr>
+              <w:keepNext/>
               <w:spacing w:after="0" w:line="240" w:lineRule="auto"/>
             </w:pPr>
             <w:r>
@@ -8589,6 +8882,7 @@
           </w:tcPr>
           <w:p>
             <w:pPr>
+              <w:keepNext/>
               <w:spacing w:after="0" w:line="240" w:lineRule="auto"/>
             </w:pPr>
             <w:r>
@@ -8614,6 +8908,7 @@
           </w:tcPr>
           <w:p>
             <w:pPr>
+              <w:keepNext/>
               <w:spacing w:after="0" w:line="240" w:lineRule="auto"/>
             </w:pPr>
             <w:r>
@@ -8644,6 +8939,7 @@
           </w:tcPr>
           <w:p>
             <w:pPr>
+              <w:keepNext/>
               <w:spacing w:after="0" w:line="240" w:lineRule="auto"/>
             </w:pPr>
             <w:r>
@@ -8669,6 +8965,7 @@
           </w:tcPr>
           <w:p>
             <w:pPr>
+              <w:keepNext/>
               <w:spacing w:after="0" w:line="240" w:lineRule="auto"/>
             </w:pPr>
             <w:r>
@@ -8699,6 +8996,7 @@
           </w:tcPr>
           <w:p>
             <w:pPr>
+              <w:keepNext/>
               <w:spacing w:after="0" w:line="240" w:lineRule="auto"/>
             </w:pPr>
             <w:r>
@@ -8724,6 +9022,7 @@
           </w:tcPr>
           <w:p>
             <w:pPr>
+              <w:keepNext/>
               <w:spacing w:after="0" w:line="240" w:lineRule="auto"/>
             </w:pPr>
             <w:r>
@@ -8760,6 +9059,7 @@
           </w:tcPr>
           <w:p>
             <w:pPr>
+              <w:keepNext/>
               <w:spacing w:after="0" w:line="240" w:lineRule="auto"/>
             </w:pPr>
             <w:r>
@@ -8785,6 +9085,7 @@
           </w:tcPr>
           <w:p>
             <w:pPr>
+              <w:keepNext/>
               <w:spacing w:after="0" w:line="240" w:lineRule="auto"/>
             </w:pPr>
             <w:r>
@@ -8914,6 +9215,7 @@
           </w:tcPr>
           <w:p>
             <w:pPr>
+              <w:keepNext/>
               <w:jc w:val="center"/>
             </w:pPr>
             <w:r>
@@ -8941,6 +9243,7 @@
           </w:tcPr>
           <w:p>
             <w:pPr>
+              <w:keepNext/>
               <w:jc w:val="center"/>
             </w:pPr>
             <w:r>
@@ -8972,6 +9275,7 @@
           </w:tcPr>
           <w:p>
             <w:pPr>
+              <w:keepNext/>
               <w:spacing w:after="0" w:line="240" w:lineRule="auto"/>
             </w:pPr>
             <w:r>
@@ -8997,15 +9301,16 @@
           </w:tcPr>
           <w:p>
             <w:pPr>
-              <w:spacing w:after="0" w:line="240" w:lineRule="auto"/>
-            </w:pPr>
-            <w:r>
-              <w:rPr>
-                <w:rFonts w:ascii="Malgun Gothic" w:hAnsi="Malgun Gothic" w:eastAsia="Malgun Gothic"/>
-                <w:color w:val="1F2937"/>
-                <w:sz w:val="16"/>
-              </w:rPr>
-              <w:t>REQ-COM-006~008,REQ-COM-011; REQ-DATA-001</w:t>
+              <w:keepNext/>
+              <w:spacing w:after="0" w:line="240" w:lineRule="auto"/>
+            </w:pPr>
+            <w:r>
+              <w:rPr>
+                <w:rFonts w:ascii="Malgun Gothic" w:hAnsi="Malgun Gothic" w:eastAsia="Malgun Gothic"/>
+                <w:color w:val="1F2937"/>
+                <w:sz w:val="16"/>
+              </w:rPr>
+              <w:t>REQ-COM-006~008; REQ-DATA-001; REQ-PERF-001; REQ-COMP-005</w:t>
             </w:r>
           </w:p>
         </w:tc>
@@ -9027,6 +9332,7 @@
           </w:tcPr>
           <w:p>
             <w:pPr>
+              <w:keepNext/>
               <w:spacing w:after="0" w:line="240" w:lineRule="auto"/>
             </w:pPr>
             <w:r>
@@ -9052,6 +9358,7 @@
           </w:tcPr>
           <w:p>
             <w:pPr>
+              <w:keepNext/>
               <w:spacing w:after="0" w:line="240" w:lineRule="auto"/>
             </w:pPr>
             <w:r>
@@ -9082,6 +9389,7 @@
           </w:tcPr>
           <w:p>
             <w:pPr>
+              <w:keepNext/>
               <w:spacing w:after="0" w:line="240" w:lineRule="auto"/>
             </w:pPr>
             <w:r>
@@ -9107,6 +9415,7 @@
           </w:tcPr>
           <w:p>
             <w:pPr>
+              <w:keepNext/>
               <w:spacing w:after="0" w:line="240" w:lineRule="auto"/>
             </w:pPr>
             <w:r>
@@ -9137,6 +9446,7 @@
           </w:tcPr>
           <w:p>
             <w:pPr>
+              <w:keepNext/>
               <w:spacing w:after="0" w:line="240" w:lineRule="auto"/>
             </w:pPr>
             <w:r>
@@ -9162,6 +9472,7 @@
           </w:tcPr>
           <w:p>
             <w:pPr>
+              <w:keepNext/>
               <w:spacing w:after="0" w:line="240" w:lineRule="auto"/>
             </w:pPr>
             <w:r>
@@ -9192,6 +9503,7 @@
           </w:tcPr>
           <w:p>
             <w:pPr>
+              <w:keepNext/>
               <w:spacing w:after="0" w:line="240" w:lineRule="auto"/>
             </w:pPr>
             <w:r>
@@ -9217,6 +9529,7 @@
           </w:tcPr>
           <w:p>
             <w:pPr>
+              <w:keepNext/>
               <w:spacing w:after="0" w:line="240" w:lineRule="auto"/>
             </w:pPr>
             <w:r>
@@ -9253,6 +9566,7 @@
           </w:tcPr>
           <w:p>
             <w:pPr>
+              <w:keepNext/>
               <w:spacing w:after="0" w:line="240" w:lineRule="auto"/>
             </w:pPr>
             <w:r>
@@ -9278,6 +9592,7 @@
           </w:tcPr>
           <w:p>
             <w:pPr>
+              <w:keepNext/>
               <w:spacing w:after="0" w:line="240" w:lineRule="auto"/>
             </w:pPr>
             <w:r>
@@ -9407,6 +9722,7 @@
           </w:tcPr>
           <w:p>
             <w:pPr>
+              <w:keepNext/>
               <w:jc w:val="center"/>
             </w:pPr>
             <w:r>
@@ -9434,6 +9750,7 @@
           </w:tcPr>
           <w:p>
             <w:pPr>
+              <w:keepNext/>
               <w:jc w:val="center"/>
             </w:pPr>
             <w:r>
@@ -9465,6 +9782,7 @@
           </w:tcPr>
           <w:p>
             <w:pPr>
+              <w:keepNext/>
               <w:spacing w:after="0" w:line="240" w:lineRule="auto"/>
             </w:pPr>
             <w:r>
@@ -9490,15 +9808,16 @@
           </w:tcPr>
           <w:p>
             <w:pPr>
-              <w:spacing w:after="0" w:line="240" w:lineRule="auto"/>
-            </w:pPr>
-            <w:r>
-              <w:rPr>
-                <w:rFonts w:ascii="Malgun Gothic" w:hAnsi="Malgun Gothic" w:eastAsia="Malgun Gothic"/>
-                <w:color w:val="1F2937"/>
-                <w:sz w:val="16"/>
-              </w:rPr>
-              <w:t>REQ-COM-006~009; REQ-FUNC-018</w:t>
+              <w:keepNext/>
+              <w:spacing w:after="0" w:line="240" w:lineRule="auto"/>
+            </w:pPr>
+            <w:r>
+              <w:rPr>
+                <w:rFonts w:ascii="Malgun Gothic" w:hAnsi="Malgun Gothic" w:eastAsia="Malgun Gothic"/>
+                <w:color w:val="1F2937"/>
+                <w:sz w:val="16"/>
+              </w:rPr>
+              <w:t>REQ-COM-006~009; REQ-DATA-001; REQ-PERF-001; REQ-COMP-005</w:t>
             </w:r>
           </w:p>
         </w:tc>
@@ -9520,6 +9839,7 @@
           </w:tcPr>
           <w:p>
             <w:pPr>
+              <w:keepNext/>
               <w:spacing w:after="0" w:line="240" w:lineRule="auto"/>
             </w:pPr>
             <w:r>
@@ -9545,6 +9865,7 @@
           </w:tcPr>
           <w:p>
             <w:pPr>
+              <w:keepNext/>
               <w:spacing w:after="0" w:line="240" w:lineRule="auto"/>
             </w:pPr>
             <w:r>
@@ -9575,6 +9896,7 @@
           </w:tcPr>
           <w:p>
             <w:pPr>
+              <w:keepNext/>
               <w:spacing w:after="0" w:line="240" w:lineRule="auto"/>
             </w:pPr>
             <w:r>
@@ -9600,6 +9922,7 @@
           </w:tcPr>
           <w:p>
             <w:pPr>
+              <w:keepNext/>
               <w:spacing w:after="0" w:line="240" w:lineRule="auto"/>
             </w:pPr>
             <w:r>
@@ -9630,6 +9953,7 @@
           </w:tcPr>
           <w:p>
             <w:pPr>
+              <w:keepNext/>
               <w:spacing w:after="0" w:line="240" w:lineRule="auto"/>
             </w:pPr>
             <w:r>
@@ -9655,6 +9979,7 @@
           </w:tcPr>
           <w:p>
             <w:pPr>
+              <w:keepNext/>
               <w:spacing w:after="0" w:line="240" w:lineRule="auto"/>
             </w:pPr>
             <w:r>
@@ -9685,6 +10010,7 @@
           </w:tcPr>
           <w:p>
             <w:pPr>
+              <w:keepNext/>
               <w:spacing w:after="0" w:line="240" w:lineRule="auto"/>
             </w:pPr>
             <w:r>
@@ -9710,6 +10036,7 @@
           </w:tcPr>
           <w:p>
             <w:pPr>
+              <w:keepNext/>
               <w:spacing w:after="0" w:line="240" w:lineRule="auto"/>
             </w:pPr>
             <w:r>
@@ -9748,6 +10075,7 @@
           </w:tcPr>
           <w:p>
             <w:pPr>
+              <w:keepNext/>
               <w:spacing w:after="0" w:line="240" w:lineRule="auto"/>
             </w:pPr>
             <w:r>
@@ -9773,6 +10101,7 @@
           </w:tcPr>
           <w:p>
             <w:pPr>
+              <w:keepNext/>
               <w:spacing w:after="0" w:line="240" w:lineRule="auto"/>
             </w:pPr>
             <w:r>
@@ -9902,6 +10231,7 @@
           </w:tcPr>
           <w:p>
             <w:pPr>
+              <w:keepNext/>
               <w:jc w:val="center"/>
             </w:pPr>
             <w:r>
@@ -9929,6 +10259,7 @@
           </w:tcPr>
           <w:p>
             <w:pPr>
+              <w:keepNext/>
               <w:jc w:val="center"/>
             </w:pPr>
             <w:r>
@@ -9960,6 +10291,7 @@
           </w:tcPr>
           <w:p>
             <w:pPr>
+              <w:keepNext/>
               <w:spacing w:after="0" w:line="240" w:lineRule="auto"/>
             </w:pPr>
             <w:r>
@@ -9985,15 +10317,16 @@
           </w:tcPr>
           <w:p>
             <w:pPr>
-              <w:spacing w:after="0" w:line="240" w:lineRule="auto"/>
-            </w:pPr>
-            <w:r>
-              <w:rPr>
-                <w:rFonts w:ascii="Malgun Gothic" w:hAnsi="Malgun Gothic" w:eastAsia="Malgun Gothic"/>
-                <w:color w:val="1F2937"/>
-                <w:sz w:val="16"/>
-              </w:rPr>
-              <w:t>REQ-COM-006~010,REQ-COM-014; REQ-ERR-003</w:t>
+              <w:keepNext/>
+              <w:spacing w:after="0" w:line="240" w:lineRule="auto"/>
+            </w:pPr>
+            <w:r>
+              <w:rPr>
+                <w:rFonts w:ascii="Malgun Gothic" w:hAnsi="Malgun Gothic" w:eastAsia="Malgun Gothic"/>
+                <w:color w:val="1F2937"/>
+                <w:sz w:val="16"/>
+              </w:rPr>
+              <w:t>REQ-COM-006~007, REQ-COM-010, REQ-COM-014; REQ-ERR-003; REQ-COMP-005</w:t>
             </w:r>
           </w:p>
         </w:tc>
@@ -10015,6 +10348,7 @@
           </w:tcPr>
           <w:p>
             <w:pPr>
+              <w:keepNext/>
               <w:spacing w:after="0" w:line="240" w:lineRule="auto"/>
             </w:pPr>
             <w:r>
@@ -10040,6 +10374,7 @@
           </w:tcPr>
           <w:p>
             <w:pPr>
+              <w:keepNext/>
               <w:spacing w:after="0" w:line="240" w:lineRule="auto"/>
             </w:pPr>
             <w:r>
@@ -10070,6 +10405,7 @@
           </w:tcPr>
           <w:p>
             <w:pPr>
+              <w:keepNext/>
               <w:spacing w:after="0" w:line="240" w:lineRule="auto"/>
             </w:pPr>
             <w:r>
@@ -10095,6 +10431,7 @@
           </w:tcPr>
           <w:p>
             <w:pPr>
+              <w:keepNext/>
               <w:spacing w:after="0" w:line="240" w:lineRule="auto"/>
             </w:pPr>
             <w:r>
@@ -10125,6 +10462,7 @@
           </w:tcPr>
           <w:p>
             <w:pPr>
+              <w:keepNext/>
               <w:spacing w:after="0" w:line="240" w:lineRule="auto"/>
             </w:pPr>
             <w:r>
@@ -10150,6 +10488,7 @@
           </w:tcPr>
           <w:p>
             <w:pPr>
+              <w:keepNext/>
               <w:spacing w:after="0" w:line="240" w:lineRule="auto"/>
             </w:pPr>
             <w:r>
@@ -10180,6 +10519,7 @@
           </w:tcPr>
           <w:p>
             <w:pPr>
+              <w:keepNext/>
               <w:spacing w:after="0" w:line="240" w:lineRule="auto"/>
             </w:pPr>
             <w:r>
@@ -10205,6 +10545,7 @@
           </w:tcPr>
           <w:p>
             <w:pPr>
+              <w:keepNext/>
               <w:spacing w:after="0" w:line="240" w:lineRule="auto"/>
             </w:pPr>
             <w:r>
@@ -10243,6 +10584,7 @@
           </w:tcPr>
           <w:p>
             <w:pPr>
+              <w:keepNext/>
               <w:spacing w:after="0" w:line="240" w:lineRule="auto"/>
             </w:pPr>
             <w:r>
@@ -10268,6 +10610,7 @@
           </w:tcPr>
           <w:p>
             <w:pPr>
+              <w:keepNext/>
               <w:spacing w:after="0" w:line="240" w:lineRule="auto"/>
             </w:pPr>
             <w:r>
@@ -10459,6 +10802,7 @@
           </w:tcPr>
           <w:p>
             <w:pPr>
+              <w:keepNext/>
               <w:jc w:val="center"/>
             </w:pPr>
             <w:r>
@@ -10486,6 +10830,7 @@
           </w:tcPr>
           <w:p>
             <w:pPr>
+              <w:keepNext/>
               <w:jc w:val="center"/>
             </w:pPr>
             <w:r>
@@ -10517,6 +10862,7 @@
           </w:tcPr>
           <w:p>
             <w:pPr>
+              <w:keepNext/>
               <w:spacing w:after="0" w:line="240" w:lineRule="auto"/>
             </w:pPr>
             <w:r>
@@ -10542,15 +10888,16 @@
           </w:tcPr>
           <w:p>
             <w:pPr>
-              <w:spacing w:after="0" w:line="240" w:lineRule="auto"/>
-            </w:pPr>
-            <w:r>
-              <w:rPr>
-                <w:rFonts w:ascii="Malgun Gothic" w:hAnsi="Malgun Gothic" w:eastAsia="Malgun Gothic"/>
-                <w:color w:val="1F2937"/>
-                <w:sz w:val="16"/>
-              </w:rPr>
-              <w:t>REQ-FUNC-014; REQ-DATA-006,REQ-DATA-012; REQ-RES-001</w:t>
+              <w:keepNext/>
+              <w:spacing w:after="0" w:line="240" w:lineRule="auto"/>
+            </w:pPr>
+            <w:r>
+              <w:rPr>
+                <w:rFonts w:ascii="Malgun Gothic" w:hAnsi="Malgun Gothic" w:eastAsia="Malgun Gothic"/>
+                <w:color w:val="1F2937"/>
+                <w:sz w:val="16"/>
+              </w:rPr>
+              <w:t>REQ-FUNC-014; REQ-DATA-006; REQ-RES-001</w:t>
             </w:r>
           </w:p>
         </w:tc>
@@ -10572,6 +10919,7 @@
           </w:tcPr>
           <w:p>
             <w:pPr>
+              <w:keepNext/>
               <w:spacing w:after="0" w:line="240" w:lineRule="auto"/>
             </w:pPr>
             <w:r>
@@ -10597,6 +10945,7 @@
           </w:tcPr>
           <w:p>
             <w:pPr>
+              <w:keepNext/>
               <w:spacing w:after="0" w:line="240" w:lineRule="auto"/>
             </w:pPr>
             <w:r>
@@ -10627,6 +10976,7 @@
           </w:tcPr>
           <w:p>
             <w:pPr>
+              <w:keepNext/>
               <w:spacing w:after="0" w:line="240" w:lineRule="auto"/>
             </w:pPr>
             <w:r>
@@ -10652,6 +11002,7 @@
           </w:tcPr>
           <w:p>
             <w:pPr>
+              <w:keepNext/>
               <w:spacing w:after="0" w:line="240" w:lineRule="auto"/>
             </w:pPr>
             <w:r>
@@ -10682,6 +11033,7 @@
           </w:tcPr>
           <w:p>
             <w:pPr>
+              <w:keepNext/>
               <w:spacing w:after="0" w:line="240" w:lineRule="auto"/>
             </w:pPr>
             <w:r>
@@ -10707,6 +11059,7 @@
           </w:tcPr>
           <w:p>
             <w:pPr>
+              <w:keepNext/>
               <w:spacing w:after="0" w:line="240" w:lineRule="auto"/>
             </w:pPr>
             <w:r>
@@ -10737,6 +11090,7 @@
           </w:tcPr>
           <w:p>
             <w:pPr>
+              <w:keepNext/>
               <w:spacing w:after="0" w:line="240" w:lineRule="auto"/>
             </w:pPr>
             <w:r>
@@ -10762,6 +11116,7 @@
           </w:tcPr>
           <w:p>
             <w:pPr>
+              <w:keepNext/>
               <w:spacing w:after="0" w:line="240" w:lineRule="auto"/>
             </w:pPr>
             <w:r>
@@ -10798,6 +11153,7 @@
           </w:tcPr>
           <w:p>
             <w:pPr>
+              <w:keepNext/>
               <w:spacing w:after="0" w:line="240" w:lineRule="auto"/>
             </w:pPr>
             <w:r>
@@ -10823,6 +11179,7 @@
           </w:tcPr>
           <w:p>
             <w:pPr>
+              <w:keepNext/>
               <w:spacing w:after="0" w:line="240" w:lineRule="auto"/>
             </w:pPr>
             <w:r>
@@ -10952,6 +11309,7 @@
           </w:tcPr>
           <w:p>
             <w:pPr>
+              <w:keepNext/>
               <w:jc w:val="center"/>
             </w:pPr>
             <w:r>
@@ -10979,6 +11337,7 @@
           </w:tcPr>
           <w:p>
             <w:pPr>
+              <w:keepNext/>
               <w:jc w:val="center"/>
             </w:pPr>
             <w:r>
@@ -11010,6 +11369,7 @@
           </w:tcPr>
           <w:p>
             <w:pPr>
+              <w:keepNext/>
               <w:spacing w:after="0" w:line="240" w:lineRule="auto"/>
             </w:pPr>
             <w:r>
@@ -11035,15 +11395,16 @@
           </w:tcPr>
           <w:p>
             <w:pPr>
-              <w:spacing w:after="0" w:line="240" w:lineRule="auto"/>
-            </w:pPr>
-            <w:r>
-              <w:rPr>
-                <w:rFonts w:ascii="Malgun Gothic" w:hAnsi="Malgun Gothic" w:eastAsia="Malgun Gothic"/>
-                <w:color w:val="1F2937"/>
-                <w:sz w:val="16"/>
-              </w:rPr>
-              <w:t>REQ-FUNC-015~017; REQ-IF-006,REQ-IF-012</w:t>
+              <w:keepNext/>
+              <w:spacing w:after="0" w:line="240" w:lineRule="auto"/>
+            </w:pPr>
+            <w:r>
+              <w:rPr>
+                <w:rFonts w:ascii="Malgun Gothic" w:hAnsi="Malgun Gothic" w:eastAsia="Malgun Gothic"/>
+                <w:color w:val="1F2937"/>
+                <w:sz w:val="16"/>
+              </w:rPr>
+              <w:t>REQ-FUNC-015~017; REQ-IF-004, REQ-IF-006, REQ-IF-012; REQ-ERR-002; REQ-REL-002</w:t>
             </w:r>
           </w:p>
         </w:tc>
@@ -11065,6 +11426,7 @@
           </w:tcPr>
           <w:p>
             <w:pPr>
+              <w:keepNext/>
               <w:spacing w:after="0" w:line="240" w:lineRule="auto"/>
             </w:pPr>
             <w:r>
@@ -11090,6 +11452,7 @@
           </w:tcPr>
           <w:p>
             <w:pPr>
+              <w:keepNext/>
               <w:spacing w:after="0" w:line="240" w:lineRule="auto"/>
             </w:pPr>
             <w:r>
@@ -11120,6 +11483,7 @@
           </w:tcPr>
           <w:p>
             <w:pPr>
+              <w:keepNext/>
               <w:spacing w:after="0" w:line="240" w:lineRule="auto"/>
             </w:pPr>
             <w:r>
@@ -11145,6 +11509,7 @@
           </w:tcPr>
           <w:p>
             <w:pPr>
+              <w:keepNext/>
               <w:spacing w:after="0" w:line="240" w:lineRule="auto"/>
             </w:pPr>
             <w:r>
@@ -11175,6 +11540,7 @@
           </w:tcPr>
           <w:p>
             <w:pPr>
+              <w:keepNext/>
               <w:spacing w:after="0" w:line="240" w:lineRule="auto"/>
             </w:pPr>
             <w:r>
@@ -11200,6 +11566,7 @@
           </w:tcPr>
           <w:p>
             <w:pPr>
+              <w:keepNext/>
               <w:spacing w:after="0" w:line="240" w:lineRule="auto"/>
             </w:pPr>
             <w:r>
@@ -11230,6 +11597,7 @@
           </w:tcPr>
           <w:p>
             <w:pPr>
+              <w:keepNext/>
               <w:spacing w:after="0" w:line="240" w:lineRule="auto"/>
             </w:pPr>
             <w:r>
@@ -11255,6 +11623,7 @@
           </w:tcPr>
           <w:p>
             <w:pPr>
+              <w:keepNext/>
               <w:spacing w:after="0" w:line="240" w:lineRule="auto"/>
             </w:pPr>
             <w:r>
@@ -11289,6 +11658,7 @@
           </w:tcPr>
           <w:p>
             <w:pPr>
+              <w:keepNext/>
               <w:spacing w:after="0" w:line="240" w:lineRule="auto"/>
             </w:pPr>
             <w:r>
@@ -11314,6 +11684,7 @@
           </w:tcPr>
           <w:p>
             <w:pPr>
+              <w:keepNext/>
               <w:spacing w:after="0" w:line="240" w:lineRule="auto"/>
             </w:pPr>
             <w:r>
@@ -11443,6 +11814,7 @@
           </w:tcPr>
           <w:p>
             <w:pPr>
+              <w:keepNext/>
               <w:jc w:val="center"/>
             </w:pPr>
             <w:r>
@@ -11470,6 +11842,7 @@
           </w:tcPr>
           <w:p>
             <w:pPr>
+              <w:keepNext/>
               <w:jc w:val="center"/>
             </w:pPr>
             <w:r>
@@ -11501,6 +11874,7 @@
           </w:tcPr>
           <w:p>
             <w:pPr>
+              <w:keepNext/>
               <w:spacing w:after="0" w:line="240" w:lineRule="auto"/>
             </w:pPr>
             <w:r>
@@ -11526,15 +11900,16 @@
           </w:tcPr>
           <w:p>
             <w:pPr>
-              <w:spacing w:after="0" w:line="240" w:lineRule="auto"/>
-            </w:pPr>
-            <w:r>
-              <w:rPr>
-                <w:rFonts w:ascii="Malgun Gothic" w:hAnsi="Malgun Gothic" w:eastAsia="Malgun Gothic"/>
-                <w:color w:val="1F2937"/>
-                <w:sz w:val="16"/>
-              </w:rPr>
-              <w:t>REQ-FUNC-016~018; REQ-IF-012; REQ-REL-002~003</w:t>
+              <w:keepNext/>
+              <w:spacing w:after="0" w:line="240" w:lineRule="auto"/>
+            </w:pPr>
+            <w:r>
+              <w:rPr>
+                <w:rFonts w:ascii="Malgun Gothic" w:hAnsi="Malgun Gothic" w:eastAsia="Malgun Gothic"/>
+                <w:color w:val="1F2937"/>
+                <w:sz w:val="16"/>
+              </w:rPr>
+              <w:t>REQ-FUNC-016~018; REQ-IF-004, REQ-IF-006, REQ-IF-012; REQ-ERR-002; REQ-REL-002~003</w:t>
             </w:r>
           </w:p>
         </w:tc>
@@ -11556,6 +11931,7 @@
           </w:tcPr>
           <w:p>
             <w:pPr>
+              <w:keepNext/>
               <w:spacing w:after="0" w:line="240" w:lineRule="auto"/>
             </w:pPr>
             <w:r>
@@ -11581,6 +11957,7 @@
           </w:tcPr>
           <w:p>
             <w:pPr>
+              <w:keepNext/>
               <w:spacing w:after="0" w:line="240" w:lineRule="auto"/>
             </w:pPr>
             <w:r>
@@ -11611,6 +11988,7 @@
           </w:tcPr>
           <w:p>
             <w:pPr>
+              <w:keepNext/>
               <w:spacing w:after="0" w:line="240" w:lineRule="auto"/>
             </w:pPr>
             <w:r>
@@ -11636,6 +12014,7 @@
           </w:tcPr>
           <w:p>
             <w:pPr>
+              <w:keepNext/>
               <w:spacing w:after="0" w:line="240" w:lineRule="auto"/>
             </w:pPr>
             <w:r>
@@ -11666,6 +12045,7 @@
           </w:tcPr>
           <w:p>
             <w:pPr>
+              <w:keepNext/>
               <w:spacing w:after="0" w:line="240" w:lineRule="auto"/>
             </w:pPr>
             <w:r>
@@ -11691,6 +12071,7 @@
           </w:tcPr>
           <w:p>
             <w:pPr>
+              <w:keepNext/>
               <w:spacing w:after="0" w:line="240" w:lineRule="auto"/>
             </w:pPr>
             <w:r>
@@ -11721,6 +12102,7 @@
           </w:tcPr>
           <w:p>
             <w:pPr>
+              <w:keepNext/>
               <w:spacing w:after="0" w:line="240" w:lineRule="auto"/>
             </w:pPr>
             <w:r>
@@ -11746,6 +12128,7 @@
           </w:tcPr>
           <w:p>
             <w:pPr>
+              <w:keepNext/>
               <w:spacing w:after="0" w:line="240" w:lineRule="auto"/>
             </w:pPr>
             <w:r>
@@ -11784,6 +12167,7 @@
           </w:tcPr>
           <w:p>
             <w:pPr>
+              <w:keepNext/>
               <w:spacing w:after="0" w:line="240" w:lineRule="auto"/>
             </w:pPr>
             <w:r>
@@ -11809,6 +12193,7 @@
           </w:tcPr>
           <w:p>
             <w:pPr>
+              <w:keepNext/>
               <w:spacing w:after="0" w:line="240" w:lineRule="auto"/>
             </w:pPr>
             <w:r>
@@ -11938,6 +12323,7 @@
           </w:tcPr>
           <w:p>
             <w:pPr>
+              <w:keepNext/>
               <w:jc w:val="center"/>
             </w:pPr>
             <w:r>
@@ -11965,6 +12351,7 @@
           </w:tcPr>
           <w:p>
             <w:pPr>
+              <w:keepNext/>
               <w:jc w:val="center"/>
             </w:pPr>
             <w:r>
@@ -11996,6 +12383,7 @@
           </w:tcPr>
           <w:p>
             <w:pPr>
+              <w:keepNext/>
               <w:spacing w:after="0" w:line="240" w:lineRule="auto"/>
             </w:pPr>
             <w:r>
@@ -12021,15 +12409,16 @@
           </w:tcPr>
           <w:p>
             <w:pPr>
-              <w:spacing w:after="0" w:line="240" w:lineRule="auto"/>
-            </w:pPr>
-            <w:r>
-              <w:rPr>
-                <w:rFonts w:ascii="Malgun Gothic" w:hAnsi="Malgun Gothic" w:eastAsia="Malgun Gothic"/>
-                <w:color w:val="1F2937"/>
-                <w:sz w:val="16"/>
-              </w:rPr>
-              <w:t>REQ-FUNC-019</w:t>
+              <w:keepNext/>
+              <w:spacing w:after="0" w:line="240" w:lineRule="auto"/>
+            </w:pPr>
+            <w:r>
+              <w:rPr>
+                <w:rFonts w:ascii="Malgun Gothic" w:hAnsi="Malgun Gothic" w:eastAsia="Malgun Gothic"/>
+                <w:color w:val="1F2937"/>
+                <w:sz w:val="16"/>
+              </w:rPr>
+              <w:t>REQ-FUNC-019; REQ-IF-004; REQ-ERR-002; REQ-REL-002</w:t>
             </w:r>
           </w:p>
         </w:tc>
@@ -12051,6 +12440,7 @@
           </w:tcPr>
           <w:p>
             <w:pPr>
+              <w:keepNext/>
               <w:spacing w:after="0" w:line="240" w:lineRule="auto"/>
             </w:pPr>
             <w:r>
@@ -12076,6 +12466,7 @@
           </w:tcPr>
           <w:p>
             <w:pPr>
+              <w:keepNext/>
               <w:spacing w:after="0" w:line="240" w:lineRule="auto"/>
             </w:pPr>
             <w:r>
@@ -12106,6 +12497,7 @@
           </w:tcPr>
           <w:p>
             <w:pPr>
+              <w:keepNext/>
               <w:spacing w:after="0" w:line="240" w:lineRule="auto"/>
             </w:pPr>
             <w:r>
@@ -12131,6 +12523,7 @@
           </w:tcPr>
           <w:p>
             <w:pPr>
+              <w:keepNext/>
               <w:spacing w:after="0" w:line="240" w:lineRule="auto"/>
             </w:pPr>
             <w:r>
@@ -12161,6 +12554,7 @@
           </w:tcPr>
           <w:p>
             <w:pPr>
+              <w:keepNext/>
               <w:spacing w:after="0" w:line="240" w:lineRule="auto"/>
             </w:pPr>
             <w:r>
@@ -12186,6 +12580,7 @@
           </w:tcPr>
           <w:p>
             <w:pPr>
+              <w:keepNext/>
               <w:spacing w:after="0" w:line="240" w:lineRule="auto"/>
             </w:pPr>
             <w:r>
@@ -12216,6 +12611,7 @@
           </w:tcPr>
           <w:p>
             <w:pPr>
+              <w:keepNext/>
               <w:spacing w:after="0" w:line="240" w:lineRule="auto"/>
             </w:pPr>
             <w:r>
@@ -12241,6 +12637,7 @@
           </w:tcPr>
           <w:p>
             <w:pPr>
+              <w:keepNext/>
               <w:spacing w:after="0" w:line="240" w:lineRule="auto"/>
             </w:pPr>
             <w:r>
@@ -12275,6 +12672,7 @@
           </w:tcPr>
           <w:p>
             <w:pPr>
+              <w:keepNext/>
               <w:spacing w:after="0" w:line="240" w:lineRule="auto"/>
             </w:pPr>
             <w:r>
@@ -12300,6 +12698,7 @@
           </w:tcPr>
           <w:p>
             <w:pPr>
+              <w:keepNext/>
               <w:spacing w:after="0" w:line="240" w:lineRule="auto"/>
             </w:pPr>
             <w:r>
@@ -12429,6 +12828,7 @@
           </w:tcPr>
           <w:p>
             <w:pPr>
+              <w:keepNext/>
               <w:jc w:val="center"/>
             </w:pPr>
             <w:r>
@@ -12456,6 +12856,7 @@
           </w:tcPr>
           <w:p>
             <w:pPr>
+              <w:keepNext/>
               <w:jc w:val="center"/>
             </w:pPr>
             <w:r>
@@ -12487,6 +12888,7 @@
           </w:tcPr>
           <w:p>
             <w:pPr>
+              <w:keepNext/>
               <w:spacing w:after="0" w:line="240" w:lineRule="auto"/>
             </w:pPr>
             <w:r>
@@ -12512,15 +12914,16 @@
           </w:tcPr>
           <w:p>
             <w:pPr>
-              <w:spacing w:after="0" w:line="240" w:lineRule="auto"/>
-            </w:pPr>
-            <w:r>
-              <w:rPr>
-                <w:rFonts w:ascii="Malgun Gothic" w:hAnsi="Malgun Gothic" w:eastAsia="Malgun Gothic"/>
-                <w:color w:val="1F2937"/>
-                <w:sz w:val="16"/>
-              </w:rPr>
-              <w:t>REQ-FUNC-020,REQ-FUNC-023~026; REQ-DATA-009~010</w:t>
+              <w:keepNext/>
+              <w:spacing w:after="0" w:line="240" w:lineRule="auto"/>
+            </w:pPr>
+            <w:r>
+              <w:rPr>
+                <w:rFonts w:ascii="Malgun Gothic" w:hAnsi="Malgun Gothic" w:eastAsia="Malgun Gothic"/>
+                <w:color w:val="1F2937"/>
+                <w:sz w:val="16"/>
+              </w:rPr>
+              <w:t>REQ-FUNC-020, REQ-FUNC-023~026; REQ-DATA-009~010</w:t>
             </w:r>
           </w:p>
         </w:tc>
@@ -12542,6 +12945,7 @@
           </w:tcPr>
           <w:p>
             <w:pPr>
+              <w:keepNext/>
               <w:spacing w:after="0" w:line="240" w:lineRule="auto"/>
             </w:pPr>
             <w:r>
@@ -12567,6 +12971,7 @@
           </w:tcPr>
           <w:p>
             <w:pPr>
+              <w:keepNext/>
               <w:spacing w:after="0" w:line="240" w:lineRule="auto"/>
             </w:pPr>
             <w:r>
@@ -12597,6 +13002,7 @@
           </w:tcPr>
           <w:p>
             <w:pPr>
+              <w:keepNext/>
               <w:spacing w:after="0" w:line="240" w:lineRule="auto"/>
             </w:pPr>
             <w:r>
@@ -12622,6 +13028,7 @@
           </w:tcPr>
           <w:p>
             <w:pPr>
+              <w:keepNext/>
               <w:spacing w:after="0" w:line="240" w:lineRule="auto"/>
             </w:pPr>
             <w:r>
@@ -12652,6 +13059,7 @@
           </w:tcPr>
           <w:p>
             <w:pPr>
+              <w:keepNext/>
               <w:spacing w:after="0" w:line="240" w:lineRule="auto"/>
             </w:pPr>
             <w:r>
@@ -12677,6 +13085,7 @@
           </w:tcPr>
           <w:p>
             <w:pPr>
+              <w:keepNext/>
               <w:spacing w:after="0" w:line="240" w:lineRule="auto"/>
             </w:pPr>
             <w:r>
@@ -12707,6 +13116,7 @@
           </w:tcPr>
           <w:p>
             <w:pPr>
+              <w:keepNext/>
               <w:spacing w:after="0" w:line="240" w:lineRule="auto"/>
             </w:pPr>
             <w:r>
@@ -12732,6 +13142,7 @@
           </w:tcPr>
           <w:p>
             <w:pPr>
+              <w:keepNext/>
               <w:spacing w:after="0" w:line="240" w:lineRule="auto"/>
             </w:pPr>
             <w:r>
@@ -12768,6 +13179,7 @@
           </w:tcPr>
           <w:p>
             <w:pPr>
+              <w:keepNext/>
               <w:spacing w:after="0" w:line="240" w:lineRule="auto"/>
             </w:pPr>
             <w:r>
@@ -12793,6 +13205,7 @@
           </w:tcPr>
           <w:p>
             <w:pPr>
+              <w:keepNext/>
               <w:spacing w:after="0" w:line="240" w:lineRule="auto"/>
             </w:pPr>
             <w:r>
@@ -12922,6 +13335,7 @@
           </w:tcPr>
           <w:p>
             <w:pPr>
+              <w:keepNext/>
               <w:jc w:val="center"/>
             </w:pPr>
             <w:r>
@@ -12949,6 +13363,7 @@
           </w:tcPr>
           <w:p>
             <w:pPr>
+              <w:keepNext/>
               <w:jc w:val="center"/>
             </w:pPr>
             <w:r>
@@ -12980,6 +13395,7 @@
           </w:tcPr>
           <w:p>
             <w:pPr>
+              <w:keepNext/>
               <w:spacing w:after="0" w:line="240" w:lineRule="auto"/>
             </w:pPr>
             <w:r>
@@ -13005,15 +13421,16 @@
           </w:tcPr>
           <w:p>
             <w:pPr>
-              <w:spacing w:after="0" w:line="240" w:lineRule="auto"/>
-            </w:pPr>
-            <w:r>
-              <w:rPr>
-                <w:rFonts w:ascii="Malgun Gothic" w:hAnsi="Malgun Gothic" w:eastAsia="Malgun Gothic"/>
-                <w:color w:val="1F2937"/>
-                <w:sz w:val="16"/>
-              </w:rPr>
-              <w:t>REQ-FUNC-020~025,REQ-FUNC-028~029; REQ-IF-013</w:t>
+              <w:keepNext/>
+              <w:spacing w:after="0" w:line="240" w:lineRule="auto"/>
+            </w:pPr>
+            <w:r>
+              <w:rPr>
+                <w:rFonts w:ascii="Malgun Gothic" w:hAnsi="Malgun Gothic" w:eastAsia="Malgun Gothic"/>
+                <w:color w:val="1F2937"/>
+                <w:sz w:val="16"/>
+              </w:rPr>
+              <w:t>REQ-FUNC-020~025, REQ-FUNC-028~029; REQ-IF-004, REQ-IF-006, REQ-IF-013; REQ-ERR-002</w:t>
             </w:r>
           </w:p>
         </w:tc>
@@ -13035,6 +13452,7 @@
           </w:tcPr>
           <w:p>
             <w:pPr>
+              <w:keepNext/>
               <w:spacing w:after="0" w:line="240" w:lineRule="auto"/>
             </w:pPr>
             <w:r>
@@ -13060,6 +13478,7 @@
           </w:tcPr>
           <w:p>
             <w:pPr>
+              <w:keepNext/>
               <w:spacing w:after="0" w:line="240" w:lineRule="auto"/>
             </w:pPr>
             <w:r>
@@ -13090,6 +13509,7 @@
           </w:tcPr>
           <w:p>
             <w:pPr>
+              <w:keepNext/>
               <w:spacing w:after="0" w:line="240" w:lineRule="auto"/>
             </w:pPr>
             <w:r>
@@ -13115,6 +13535,7 @@
           </w:tcPr>
           <w:p>
             <w:pPr>
+              <w:keepNext/>
               <w:spacing w:after="0" w:line="240" w:lineRule="auto"/>
             </w:pPr>
             <w:r>
@@ -13145,6 +13566,7 @@
           </w:tcPr>
           <w:p>
             <w:pPr>
+              <w:keepNext/>
               <w:spacing w:after="0" w:line="240" w:lineRule="auto"/>
             </w:pPr>
             <w:r>
@@ -13170,6 +13592,7 @@
           </w:tcPr>
           <w:p>
             <w:pPr>
+              <w:keepNext/>
               <w:spacing w:after="0" w:line="240" w:lineRule="auto"/>
             </w:pPr>
             <w:r>
@@ -13200,6 +13623,7 @@
           </w:tcPr>
           <w:p>
             <w:pPr>
+              <w:keepNext/>
               <w:spacing w:after="0" w:line="240" w:lineRule="auto"/>
             </w:pPr>
             <w:r>
@@ -13225,6 +13649,7 @@
           </w:tcPr>
           <w:p>
             <w:pPr>
+              <w:keepNext/>
               <w:spacing w:after="0" w:line="240" w:lineRule="auto"/>
             </w:pPr>
             <w:r>
@@ -13263,6 +13688,7 @@
           </w:tcPr>
           <w:p>
             <w:pPr>
+              <w:keepNext/>
               <w:spacing w:after="0" w:line="240" w:lineRule="auto"/>
             </w:pPr>
             <w:r>
@@ -13288,6 +13714,7 @@
           </w:tcPr>
           <w:p>
             <w:pPr>
+              <w:keepNext/>
               <w:spacing w:after="0" w:line="240" w:lineRule="auto"/>
             </w:pPr>
             <w:r>
@@ -13417,6 +13844,7 @@
           </w:tcPr>
           <w:p>
             <w:pPr>
+              <w:keepNext/>
               <w:jc w:val="center"/>
             </w:pPr>
             <w:r>
@@ -13444,6 +13872,7 @@
           </w:tcPr>
           <w:p>
             <w:pPr>
+              <w:keepNext/>
               <w:jc w:val="center"/>
             </w:pPr>
             <w:r>
@@ -13475,6 +13904,7 @@
           </w:tcPr>
           <w:p>
             <w:pPr>
+              <w:keepNext/>
               <w:spacing w:after="0" w:line="240" w:lineRule="auto"/>
             </w:pPr>
             <w:r>
@@ -13500,15 +13930,16 @@
           </w:tcPr>
           <w:p>
             <w:pPr>
-              <w:spacing w:after="0" w:line="240" w:lineRule="auto"/>
-            </w:pPr>
-            <w:r>
-              <w:rPr>
-                <w:rFonts w:ascii="Malgun Gothic" w:hAnsi="Malgun Gothic" w:eastAsia="Malgun Gothic"/>
-                <w:color w:val="1F2937"/>
-                <w:sz w:val="16"/>
-              </w:rPr>
-              <w:t>REQ-FUNC-020~025,REQ-FUNC-028~029; REQ-IF-013</w:t>
+              <w:keepNext/>
+              <w:spacing w:after="0" w:line="240" w:lineRule="auto"/>
+            </w:pPr>
+            <w:r>
+              <w:rPr>
+                <w:rFonts w:ascii="Malgun Gothic" w:hAnsi="Malgun Gothic" w:eastAsia="Malgun Gothic"/>
+                <w:color w:val="1F2937"/>
+                <w:sz w:val="16"/>
+              </w:rPr>
+              <w:t>REQ-FUNC-020~025, REQ-FUNC-028~029; REQ-IF-004, REQ-IF-013; REQ-ERR-002</w:t>
             </w:r>
           </w:p>
         </w:tc>
@@ -13530,6 +13961,7 @@
           </w:tcPr>
           <w:p>
             <w:pPr>
+              <w:keepNext/>
               <w:spacing w:after="0" w:line="240" w:lineRule="auto"/>
             </w:pPr>
             <w:r>
@@ -13555,6 +13987,7 @@
           </w:tcPr>
           <w:p>
             <w:pPr>
+              <w:keepNext/>
               <w:spacing w:after="0" w:line="240" w:lineRule="auto"/>
             </w:pPr>
             <w:r>
@@ -13585,6 +14018,7 @@
           </w:tcPr>
           <w:p>
             <w:pPr>
+              <w:keepNext/>
               <w:spacing w:after="0" w:line="240" w:lineRule="auto"/>
             </w:pPr>
             <w:r>
@@ -13610,6 +14044,7 @@
           </w:tcPr>
           <w:p>
             <w:pPr>
+              <w:keepNext/>
               <w:spacing w:after="0" w:line="240" w:lineRule="auto"/>
             </w:pPr>
             <w:r>
@@ -13640,6 +14075,7 @@
           </w:tcPr>
           <w:p>
             <w:pPr>
+              <w:keepNext/>
               <w:spacing w:after="0" w:line="240" w:lineRule="auto"/>
             </w:pPr>
             <w:r>
@@ -13665,6 +14101,7 @@
           </w:tcPr>
           <w:p>
             <w:pPr>
+              <w:keepNext/>
               <w:spacing w:after="0" w:line="240" w:lineRule="auto"/>
             </w:pPr>
             <w:r>
@@ -13695,6 +14132,7 @@
           </w:tcPr>
           <w:p>
             <w:pPr>
+              <w:keepNext/>
               <w:spacing w:after="0" w:line="240" w:lineRule="auto"/>
             </w:pPr>
             <w:r>
@@ -13720,6 +14158,7 @@
           </w:tcPr>
           <w:p>
             <w:pPr>
+              <w:keepNext/>
               <w:spacing w:after="0" w:line="240" w:lineRule="auto"/>
             </w:pPr>
             <w:r>
@@ -13756,6 +14195,7 @@
           </w:tcPr>
           <w:p>
             <w:pPr>
+              <w:keepNext/>
               <w:spacing w:after="0" w:line="240" w:lineRule="auto"/>
             </w:pPr>
             <w:r>
@@ -13781,6 +14221,7 @@
           </w:tcPr>
           <w:p>
             <w:pPr>
+              <w:keepNext/>
               <w:spacing w:after="0" w:line="240" w:lineRule="auto"/>
             </w:pPr>
             <w:r>
@@ -13910,6 +14351,7 @@
           </w:tcPr>
           <w:p>
             <w:pPr>
+              <w:keepNext/>
               <w:jc w:val="center"/>
             </w:pPr>
             <w:r>
@@ -13937,6 +14379,7 @@
           </w:tcPr>
           <w:p>
             <w:pPr>
+              <w:keepNext/>
               <w:jc w:val="center"/>
             </w:pPr>
             <w:r>
@@ -13968,6 +14411,7 @@
           </w:tcPr>
           <w:p>
             <w:pPr>
+              <w:keepNext/>
               <w:spacing w:after="0" w:line="240" w:lineRule="auto"/>
             </w:pPr>
             <w:r>
@@ -13993,15 +14437,16 @@
           </w:tcPr>
           <w:p>
             <w:pPr>
-              <w:spacing w:after="0" w:line="240" w:lineRule="auto"/>
-            </w:pPr>
-            <w:r>
-              <w:rPr>
-                <w:rFonts w:ascii="Malgun Gothic" w:hAnsi="Malgun Gothic" w:eastAsia="Malgun Gothic"/>
-                <w:color w:val="1F2937"/>
-                <w:sz w:val="16"/>
-              </w:rPr>
-              <w:t>REQ-FUNC-021~028; REQ-FUNC-012</w:t>
+              <w:keepNext/>
+              <w:spacing w:after="0" w:line="240" w:lineRule="auto"/>
+            </w:pPr>
+            <w:r>
+              <w:rPr>
+                <w:rFonts w:ascii="Malgun Gothic" w:hAnsi="Malgun Gothic" w:eastAsia="Malgun Gothic"/>
+                <w:color w:val="1F2937"/>
+                <w:sz w:val="16"/>
+              </w:rPr>
+              <w:t>REQ-FUNC-021~025, REQ-FUNC-027~028; REQ-ERR-002</w:t>
             </w:r>
           </w:p>
         </w:tc>
@@ -14023,6 +14468,7 @@
           </w:tcPr>
           <w:p>
             <w:pPr>
+              <w:keepNext/>
               <w:spacing w:after="0" w:line="240" w:lineRule="auto"/>
             </w:pPr>
             <w:r>
@@ -14048,6 +14494,7 @@
           </w:tcPr>
           <w:p>
             <w:pPr>
+              <w:keepNext/>
               <w:spacing w:after="0" w:line="240" w:lineRule="auto"/>
             </w:pPr>
             <w:r>
@@ -14078,6 +14525,7 @@
           </w:tcPr>
           <w:p>
             <w:pPr>
+              <w:keepNext/>
               <w:spacing w:after="0" w:line="240" w:lineRule="auto"/>
             </w:pPr>
             <w:r>
@@ -14103,6 +14551,7 @@
           </w:tcPr>
           <w:p>
             <w:pPr>
+              <w:keepNext/>
               <w:spacing w:after="0" w:line="240" w:lineRule="auto"/>
             </w:pPr>
             <w:r>
@@ -14133,6 +14582,7 @@
           </w:tcPr>
           <w:p>
             <w:pPr>
+              <w:keepNext/>
               <w:spacing w:after="0" w:line="240" w:lineRule="auto"/>
             </w:pPr>
             <w:r>
@@ -14158,6 +14608,7 @@
           </w:tcPr>
           <w:p>
             <w:pPr>
+              <w:keepNext/>
               <w:spacing w:after="0" w:line="240" w:lineRule="auto"/>
             </w:pPr>
             <w:r>
@@ -14188,6 +14639,7 @@
           </w:tcPr>
           <w:p>
             <w:pPr>
+              <w:keepNext/>
               <w:spacing w:after="0" w:line="240" w:lineRule="auto"/>
             </w:pPr>
             <w:r>
@@ -14213,6 +14665,7 @@
           </w:tcPr>
           <w:p>
             <w:pPr>
+              <w:keepNext/>
               <w:spacing w:after="0" w:line="240" w:lineRule="auto"/>
             </w:pPr>
             <w:r>
@@ -14249,6 +14702,7 @@
           </w:tcPr>
           <w:p>
             <w:pPr>
+              <w:keepNext/>
               <w:spacing w:after="0" w:line="240" w:lineRule="auto"/>
             </w:pPr>
             <w:r>
@@ -14274,6 +14728,7 @@
           </w:tcPr>
           <w:p>
             <w:pPr>
+              <w:keepNext/>
               <w:spacing w:after="0" w:line="240" w:lineRule="auto"/>
             </w:pPr>
             <w:r>
@@ -14411,6 +14866,7 @@
           </w:tcPr>
           <w:p>
             <w:pPr>
+              <w:keepNext/>
               <w:jc w:val="center"/>
             </w:pPr>
             <w:r>
@@ -14438,6 +14894,7 @@
           </w:tcPr>
           <w:p>
             <w:pPr>
+              <w:keepNext/>
               <w:jc w:val="center"/>
             </w:pPr>
             <w:r>
@@ -14469,6 +14926,7 @@
           </w:tcPr>
           <w:p>
             <w:pPr>
+              <w:keepNext/>
               <w:spacing w:after="0" w:line="240" w:lineRule="auto"/>
             </w:pPr>
             <w:r>
@@ -14494,15 +14952,16 @@
           </w:tcPr>
           <w:p>
             <w:pPr>
-              <w:spacing w:after="0" w:line="240" w:lineRule="auto"/>
-            </w:pPr>
-            <w:r>
-              <w:rPr>
-                <w:rFonts w:ascii="Malgun Gothic" w:hAnsi="Malgun Gothic" w:eastAsia="Malgun Gothic"/>
-                <w:color w:val="1F2937"/>
-                <w:sz w:val="16"/>
-              </w:rPr>
-              <w:t>REQ-FUNC-030,REQ-FUNC-032,REQ-FUNC-039</w:t>
+              <w:keepNext/>
+              <w:spacing w:after="0" w:line="240" w:lineRule="auto"/>
+            </w:pPr>
+            <w:r>
+              <w:rPr>
+                <w:rFonts w:ascii="Malgun Gothic" w:hAnsi="Malgun Gothic" w:eastAsia="Malgun Gothic"/>
+                <w:color w:val="1F2937"/>
+                <w:sz w:val="16"/>
+              </w:rPr>
+              <w:t>REQ-FUNC-030, REQ-FUNC-032, REQ-FUNC-039; REQ-IF-004</w:t>
             </w:r>
           </w:p>
         </w:tc>
@@ -14524,6 +14983,7 @@
           </w:tcPr>
           <w:p>
             <w:pPr>
+              <w:keepNext/>
               <w:spacing w:after="0" w:line="240" w:lineRule="auto"/>
             </w:pPr>
             <w:r>
@@ -14549,6 +15009,7 @@
           </w:tcPr>
           <w:p>
             <w:pPr>
+              <w:keepNext/>
               <w:spacing w:after="0" w:line="240" w:lineRule="auto"/>
             </w:pPr>
             <w:r>
@@ -14579,6 +15040,7 @@
           </w:tcPr>
           <w:p>
             <w:pPr>
+              <w:keepNext/>
               <w:spacing w:after="0" w:line="240" w:lineRule="auto"/>
             </w:pPr>
             <w:r>
@@ -14604,6 +15066,7 @@
           </w:tcPr>
           <w:p>
             <w:pPr>
+              <w:keepNext/>
               <w:spacing w:after="0" w:line="240" w:lineRule="auto"/>
             </w:pPr>
             <w:r>
@@ -14634,6 +15097,7 @@
           </w:tcPr>
           <w:p>
             <w:pPr>
+              <w:keepNext/>
               <w:spacing w:after="0" w:line="240" w:lineRule="auto"/>
             </w:pPr>
             <w:r>
@@ -14659,6 +15123,7 @@
           </w:tcPr>
           <w:p>
             <w:pPr>
+              <w:keepNext/>
               <w:spacing w:after="0" w:line="240" w:lineRule="auto"/>
             </w:pPr>
             <w:r>
@@ -14689,6 +15154,7 @@
           </w:tcPr>
           <w:p>
             <w:pPr>
+              <w:keepNext/>
               <w:spacing w:after="0" w:line="240" w:lineRule="auto"/>
             </w:pPr>
             <w:r>
@@ -14714,6 +15180,7 @@
           </w:tcPr>
           <w:p>
             <w:pPr>
+              <w:keepNext/>
               <w:spacing w:after="0" w:line="240" w:lineRule="auto"/>
             </w:pPr>
             <w:r>
@@ -14750,6 +15217,7 @@
           </w:tcPr>
           <w:p>
             <w:pPr>
+              <w:keepNext/>
               <w:spacing w:after="0" w:line="240" w:lineRule="auto"/>
             </w:pPr>
             <w:r>
@@ -14775,6 +15243,7 @@
           </w:tcPr>
           <w:p>
             <w:pPr>
+              <w:keepNext/>
               <w:spacing w:after="0" w:line="240" w:lineRule="auto"/>
             </w:pPr>
             <w:r>
@@ -14904,6 +15373,7 @@
           </w:tcPr>
           <w:p>
             <w:pPr>
+              <w:keepNext/>
               <w:jc w:val="center"/>
             </w:pPr>
             <w:r>
@@ -14931,6 +15401,7 @@
           </w:tcPr>
           <w:p>
             <w:pPr>
+              <w:keepNext/>
               <w:jc w:val="center"/>
             </w:pPr>
             <w:r>
@@ -14962,6 +15433,7 @@
           </w:tcPr>
           <w:p>
             <w:pPr>
+              <w:keepNext/>
               <w:spacing w:after="0" w:line="240" w:lineRule="auto"/>
             </w:pPr>
             <w:r>
@@ -14987,15 +15459,16 @@
           </w:tcPr>
           <w:p>
             <w:pPr>
-              <w:spacing w:after="0" w:line="240" w:lineRule="auto"/>
-            </w:pPr>
-            <w:r>
-              <w:rPr>
-                <w:rFonts w:ascii="Malgun Gothic" w:hAnsi="Malgun Gothic" w:eastAsia="Malgun Gothic"/>
-                <w:color w:val="1F2937"/>
-                <w:sz w:val="16"/>
-              </w:rPr>
-              <w:t>REQ-FUNC-031,REQ-FUNC-038; REQ-PERF-004</w:t>
+              <w:keepNext/>
+              <w:spacing w:after="0" w:line="240" w:lineRule="auto"/>
+            </w:pPr>
+            <w:r>
+              <w:rPr>
+                <w:rFonts w:ascii="Malgun Gothic" w:hAnsi="Malgun Gothic" w:eastAsia="Malgun Gothic"/>
+                <w:color w:val="1F2937"/>
+                <w:sz w:val="16"/>
+              </w:rPr>
+              <w:t>REQ-FUNC-031, REQ-FUNC-038; REQ-IF-004; REQ-PERF-004</w:t>
             </w:r>
           </w:p>
         </w:tc>
@@ -15017,6 +15490,7 @@
           </w:tcPr>
           <w:p>
             <w:pPr>
+              <w:keepNext/>
               <w:spacing w:after="0" w:line="240" w:lineRule="auto"/>
             </w:pPr>
             <w:r>
@@ -15042,6 +15516,7 @@
           </w:tcPr>
           <w:p>
             <w:pPr>
+              <w:keepNext/>
               <w:spacing w:after="0" w:line="240" w:lineRule="auto"/>
             </w:pPr>
             <w:r>
@@ -15072,6 +15547,7 @@
           </w:tcPr>
           <w:p>
             <w:pPr>
+              <w:keepNext/>
               <w:spacing w:after="0" w:line="240" w:lineRule="auto"/>
             </w:pPr>
             <w:r>
@@ -15097,6 +15573,7 @@
           </w:tcPr>
           <w:p>
             <w:pPr>
+              <w:keepNext/>
               <w:spacing w:after="0" w:line="240" w:lineRule="auto"/>
             </w:pPr>
             <w:r>
@@ -15127,6 +15604,7 @@
           </w:tcPr>
           <w:p>
             <w:pPr>
+              <w:keepNext/>
               <w:spacing w:after="0" w:line="240" w:lineRule="auto"/>
             </w:pPr>
             <w:r>
@@ -15152,6 +15630,7 @@
           </w:tcPr>
           <w:p>
             <w:pPr>
+              <w:keepNext/>
               <w:spacing w:after="0" w:line="240" w:lineRule="auto"/>
             </w:pPr>
             <w:r>
@@ -15182,6 +15661,7 @@
           </w:tcPr>
           <w:p>
             <w:pPr>
+              <w:keepNext/>
               <w:spacing w:after="0" w:line="240" w:lineRule="auto"/>
             </w:pPr>
             <w:r>
@@ -15207,6 +15687,7 @@
           </w:tcPr>
           <w:p>
             <w:pPr>
+              <w:keepNext/>
               <w:spacing w:after="0" w:line="240" w:lineRule="auto"/>
             </w:pPr>
             <w:r>
@@ -15243,6 +15724,7 @@
           </w:tcPr>
           <w:p>
             <w:pPr>
+              <w:keepNext/>
               <w:spacing w:after="0" w:line="240" w:lineRule="auto"/>
             </w:pPr>
             <w:r>
@@ -15268,6 +15750,7 @@
           </w:tcPr>
           <w:p>
             <w:pPr>
+              <w:keepNext/>
               <w:spacing w:after="0" w:line="240" w:lineRule="auto"/>
             </w:pPr>
             <w:r>
@@ -15397,6 +15880,7 @@
           </w:tcPr>
           <w:p>
             <w:pPr>
+              <w:keepNext/>
               <w:jc w:val="center"/>
             </w:pPr>
             <w:r>
@@ -15424,6 +15908,7 @@
           </w:tcPr>
           <w:p>
             <w:pPr>
+              <w:keepNext/>
               <w:jc w:val="center"/>
             </w:pPr>
             <w:r>
@@ -15455,6 +15940,7 @@
           </w:tcPr>
           <w:p>
             <w:pPr>
+              <w:keepNext/>
               <w:spacing w:after="0" w:line="240" w:lineRule="auto"/>
             </w:pPr>
             <w:r>
@@ -15480,15 +15966,16 @@
           </w:tcPr>
           <w:p>
             <w:pPr>
-              <w:spacing w:after="0" w:line="240" w:lineRule="auto"/>
-            </w:pPr>
-            <w:r>
-              <w:rPr>
-                <w:rFonts w:ascii="Malgun Gothic" w:hAnsi="Malgun Gothic" w:eastAsia="Malgun Gothic"/>
-                <w:color w:val="1F2937"/>
-                <w:sz w:val="16"/>
-              </w:rPr>
-              <w:t>REQ-FUNC-032~033; REQ-IF-007,REQ-IF-014</w:t>
+              <w:keepNext/>
+              <w:spacing w:after="0" w:line="240" w:lineRule="auto"/>
+            </w:pPr>
+            <w:r>
+              <w:rPr>
+                <w:rFonts w:ascii="Malgun Gothic" w:hAnsi="Malgun Gothic" w:eastAsia="Malgun Gothic"/>
+                <w:color w:val="1F2937"/>
+                <w:sz w:val="16"/>
+              </w:rPr>
+              <w:t>REQ-FUNC-032~033; REQ-COM-021; REQ-IF-004, REQ-IF-006~007, REQ-IF-014; REQ-PERF-002~003; REQ-REL-005; REQ-RES-003</w:t>
             </w:r>
           </w:p>
         </w:tc>
@@ -15510,6 +15997,7 @@
           </w:tcPr>
           <w:p>
             <w:pPr>
+              <w:keepNext/>
               <w:spacing w:after="0" w:line="240" w:lineRule="auto"/>
             </w:pPr>
             <w:r>
@@ -15535,6 +16023,7 @@
           </w:tcPr>
           <w:p>
             <w:pPr>
+              <w:keepNext/>
               <w:spacing w:after="0" w:line="240" w:lineRule="auto"/>
             </w:pPr>
             <w:r>
@@ -15565,6 +16054,7 @@
           </w:tcPr>
           <w:p>
             <w:pPr>
+              <w:keepNext/>
               <w:spacing w:after="0" w:line="240" w:lineRule="auto"/>
             </w:pPr>
             <w:r>
@@ -15590,6 +16080,7 @@
           </w:tcPr>
           <w:p>
             <w:pPr>
+              <w:keepNext/>
               <w:spacing w:after="0" w:line="240" w:lineRule="auto"/>
             </w:pPr>
             <w:r>
@@ -15620,6 +16111,7 @@
           </w:tcPr>
           <w:p>
             <w:pPr>
+              <w:keepNext/>
               <w:spacing w:after="0" w:line="240" w:lineRule="auto"/>
             </w:pPr>
             <w:r>
@@ -15645,6 +16137,7 @@
           </w:tcPr>
           <w:p>
             <w:pPr>
+              <w:keepNext/>
               <w:spacing w:after="0" w:line="240" w:lineRule="auto"/>
             </w:pPr>
             <w:r>
@@ -15675,6 +16168,7 @@
           </w:tcPr>
           <w:p>
             <w:pPr>
+              <w:keepNext/>
               <w:spacing w:after="0" w:line="240" w:lineRule="auto"/>
             </w:pPr>
             <w:r>
@@ -15700,6 +16194,7 @@
           </w:tcPr>
           <w:p>
             <w:pPr>
+              <w:keepNext/>
               <w:spacing w:after="0" w:line="240" w:lineRule="auto"/>
             </w:pPr>
             <w:r>
@@ -15736,6 +16231,7 @@
           </w:tcPr>
           <w:p>
             <w:pPr>
+              <w:keepNext/>
               <w:spacing w:after="0" w:line="240" w:lineRule="auto"/>
             </w:pPr>
             <w:r>
@@ -15761,6 +16257,7 @@
           </w:tcPr>
           <w:p>
             <w:pPr>
+              <w:keepNext/>
               <w:spacing w:after="0" w:line="240" w:lineRule="auto"/>
             </w:pPr>
             <w:r>
@@ -15890,6 +16387,7 @@
           </w:tcPr>
           <w:p>
             <w:pPr>
+              <w:keepNext/>
               <w:jc w:val="center"/>
             </w:pPr>
             <w:r>
@@ -15917,6 +16415,7 @@
           </w:tcPr>
           <w:p>
             <w:pPr>
+              <w:keepNext/>
               <w:jc w:val="center"/>
             </w:pPr>
             <w:r>
@@ -15948,6 +16447,7 @@
           </w:tcPr>
           <w:p>
             <w:pPr>
+              <w:keepNext/>
               <w:spacing w:after="0" w:line="240" w:lineRule="auto"/>
             </w:pPr>
             <w:r>
@@ -15973,15 +16473,16 @@
           </w:tcPr>
           <w:p>
             <w:pPr>
-              <w:spacing w:after="0" w:line="240" w:lineRule="auto"/>
-            </w:pPr>
-            <w:r>
-              <w:rPr>
-                <w:rFonts w:ascii="Malgun Gothic" w:hAnsi="Malgun Gothic" w:eastAsia="Malgun Gothic"/>
-                <w:color w:val="1F2937"/>
-                <w:sz w:val="16"/>
-              </w:rPr>
-              <w:t>REQ-FUNC-018,REQ-FUNC-034~035,REQ-FUNC-039; REQ-IF-014</w:t>
+              <w:keepNext/>
+              <w:spacing w:after="0" w:line="240" w:lineRule="auto"/>
+            </w:pPr>
+            <w:r>
+              <w:rPr>
+                <w:rFonts w:ascii="Malgun Gothic" w:hAnsi="Malgun Gothic" w:eastAsia="Malgun Gothic"/>
+                <w:color w:val="1F2937"/>
+                <w:sz w:val="16"/>
+              </w:rPr>
+              <w:t>REQ-FUNC-018, REQ-FUNC-034~035, REQ-FUNC-039; REQ-COM-021; REQ-IF-004, REQ-IF-006~007, REQ-IF-014; REQ-PERF-002~003; REQ-REL-002, REQ-REL-004~006; REQ-RES-003~004</w:t>
             </w:r>
           </w:p>
         </w:tc>
@@ -16003,6 +16504,7 @@
           </w:tcPr>
           <w:p>
             <w:pPr>
+              <w:keepNext/>
               <w:spacing w:after="0" w:line="240" w:lineRule="auto"/>
             </w:pPr>
             <w:r>
@@ -16028,6 +16530,7 @@
           </w:tcPr>
           <w:p>
             <w:pPr>
+              <w:keepNext/>
               <w:spacing w:after="0" w:line="240" w:lineRule="auto"/>
             </w:pPr>
             <w:r>
@@ -16058,6 +16561,7 @@
           </w:tcPr>
           <w:p>
             <w:pPr>
+              <w:keepNext/>
               <w:spacing w:after="0" w:line="240" w:lineRule="auto"/>
             </w:pPr>
             <w:r>
@@ -16083,6 +16587,7 @@
           </w:tcPr>
           <w:p>
             <w:pPr>
+              <w:keepNext/>
               <w:spacing w:after="0" w:line="240" w:lineRule="auto"/>
             </w:pPr>
             <w:r>
@@ -16113,6 +16618,7 @@
           </w:tcPr>
           <w:p>
             <w:pPr>
+              <w:keepNext/>
               <w:spacing w:after="0" w:line="240" w:lineRule="auto"/>
             </w:pPr>
             <w:r>
@@ -16138,6 +16644,7 @@
           </w:tcPr>
           <w:p>
             <w:pPr>
+              <w:keepNext/>
               <w:spacing w:after="0" w:line="240" w:lineRule="auto"/>
             </w:pPr>
             <w:r>
@@ -16168,6 +16675,7 @@
           </w:tcPr>
           <w:p>
             <w:pPr>
+              <w:keepNext/>
               <w:spacing w:after="0" w:line="240" w:lineRule="auto"/>
             </w:pPr>
             <w:r>
@@ -16193,6 +16701,7 @@
           </w:tcPr>
           <w:p>
             <w:pPr>
+              <w:keepNext/>
               <w:spacing w:after="0" w:line="240" w:lineRule="auto"/>
             </w:pPr>
             <w:r>
@@ -16229,6 +16738,7 @@
           </w:tcPr>
           <w:p>
             <w:pPr>
+              <w:keepNext/>
               <w:spacing w:after="0" w:line="240" w:lineRule="auto"/>
             </w:pPr>
             <w:r>
@@ -16254,6 +16764,7 @@
           </w:tcPr>
           <w:p>
             <w:pPr>
+              <w:keepNext/>
               <w:spacing w:after="0" w:line="240" w:lineRule="auto"/>
             </w:pPr>
             <w:r>
@@ -16383,6 +16894,7 @@
           </w:tcPr>
           <w:p>
             <w:pPr>
+              <w:keepNext/>
               <w:jc w:val="center"/>
             </w:pPr>
             <w:r>
@@ -16410,6 +16922,7 @@
           </w:tcPr>
           <w:p>
             <w:pPr>
+              <w:keepNext/>
               <w:jc w:val="center"/>
             </w:pPr>
             <w:r>
@@ -16441,6 +16954,7 @@
           </w:tcPr>
           <w:p>
             <w:pPr>
+              <w:keepNext/>
               <w:spacing w:after="0" w:line="240" w:lineRule="auto"/>
             </w:pPr>
             <w:r>
@@ -16466,6 +16980,7 @@
           </w:tcPr>
           <w:p>
             <w:pPr>
+              <w:keepNext/>
               <w:spacing w:after="0" w:line="240" w:lineRule="auto"/>
             </w:pPr>
             <w:r>
@@ -16496,6 +17011,7 @@
           </w:tcPr>
           <w:p>
             <w:pPr>
+              <w:keepNext/>
               <w:spacing w:after="0" w:line="240" w:lineRule="auto"/>
             </w:pPr>
             <w:r>
@@ -16521,6 +17037,7 @@
           </w:tcPr>
           <w:p>
             <w:pPr>
+              <w:keepNext/>
               <w:spacing w:after="0" w:line="240" w:lineRule="auto"/>
             </w:pPr>
             <w:r>
@@ -16551,6 +17068,7 @@
           </w:tcPr>
           <w:p>
             <w:pPr>
+              <w:keepNext/>
               <w:spacing w:after="0" w:line="240" w:lineRule="auto"/>
             </w:pPr>
             <w:r>
@@ -16576,6 +17094,7 @@
           </w:tcPr>
           <w:p>
             <w:pPr>
+              <w:keepNext/>
               <w:spacing w:after="0" w:line="240" w:lineRule="auto"/>
             </w:pPr>
             <w:r>
@@ -16606,6 +17125,7 @@
           </w:tcPr>
           <w:p>
             <w:pPr>
+              <w:keepNext/>
               <w:spacing w:after="0" w:line="240" w:lineRule="auto"/>
             </w:pPr>
             <w:r>
@@ -16631,6 +17151,7 @@
           </w:tcPr>
           <w:p>
             <w:pPr>
+              <w:keepNext/>
               <w:spacing w:after="0" w:line="240" w:lineRule="auto"/>
             </w:pPr>
             <w:r>
@@ -16661,6 +17182,7 @@
           </w:tcPr>
           <w:p>
             <w:pPr>
+              <w:keepNext/>
               <w:spacing w:after="0" w:line="240" w:lineRule="auto"/>
             </w:pPr>
             <w:r>
@@ -16686,6 +17208,7 @@
           </w:tcPr>
           <w:p>
             <w:pPr>
+              <w:keepNext/>
               <w:spacing w:after="0" w:line="240" w:lineRule="auto"/>
             </w:pPr>
             <w:r>
@@ -16722,6 +17245,7 @@
           </w:tcPr>
           <w:p>
             <w:pPr>
+              <w:keepNext/>
               <w:spacing w:after="0" w:line="240" w:lineRule="auto"/>
             </w:pPr>
             <w:r>
@@ -16747,6 +17271,7 @@
           </w:tcPr>
           <w:p>
             <w:pPr>
+              <w:keepNext/>
               <w:spacing w:after="0" w:line="240" w:lineRule="auto"/>
             </w:pPr>
             <w:r>
@@ -16876,6 +17401,7 @@
           </w:tcPr>
           <w:p>
             <w:pPr>
+              <w:keepNext/>
               <w:jc w:val="center"/>
             </w:pPr>
             <w:r>
@@ -16903,6 +17429,7 @@
           </w:tcPr>
           <w:p>
             <w:pPr>
+              <w:keepNext/>
               <w:jc w:val="center"/>
             </w:pPr>
             <w:r>
@@ -16934,6 +17461,7 @@
           </w:tcPr>
           <w:p>
             <w:pPr>
+              <w:keepNext/>
               <w:spacing w:after="0" w:line="240" w:lineRule="auto"/>
             </w:pPr>
             <w:r>
@@ -16959,15 +17487,16 @@
           </w:tcPr>
           <w:p>
             <w:pPr>
-              <w:spacing w:after="0" w:line="240" w:lineRule="auto"/>
-            </w:pPr>
-            <w:r>
-              <w:rPr>
-                <w:rFonts w:ascii="Malgun Gothic" w:hAnsi="Malgun Gothic" w:eastAsia="Malgun Gothic"/>
-                <w:color w:val="1F2937"/>
-                <w:sz w:val="16"/>
-              </w:rPr>
-              <w:t>REQ-FUNC-036~038; REQ-PERF-002,REQ-PERF-004; REQ-DIAG-003</w:t>
+              <w:keepNext/>
+              <w:spacing w:after="0" w:line="240" w:lineRule="auto"/>
+            </w:pPr>
+            <w:r>
+              <w:rPr>
+                <w:rFonts w:ascii="Malgun Gothic" w:hAnsi="Malgun Gothic" w:eastAsia="Malgun Gothic"/>
+                <w:color w:val="1F2937"/>
+                <w:sz w:val="16"/>
+              </w:rPr>
+              <w:t>REQ-FUNC-033, REQ-FUNC-036~038; REQ-PERF-002, REQ-PERF-004; REQ-REL-006; REQ-DIAG-003</w:t>
             </w:r>
           </w:p>
         </w:tc>
@@ -16989,6 +17518,7 @@
           </w:tcPr>
           <w:p>
             <w:pPr>
+              <w:keepNext/>
               <w:spacing w:after="0" w:line="240" w:lineRule="auto"/>
             </w:pPr>
             <w:r>
@@ -17014,6 +17544,7 @@
           </w:tcPr>
           <w:p>
             <w:pPr>
+              <w:keepNext/>
               <w:spacing w:after="0" w:line="240" w:lineRule="auto"/>
             </w:pPr>
             <w:r>
@@ -17044,6 +17575,7 @@
           </w:tcPr>
           <w:p>
             <w:pPr>
+              <w:keepNext/>
               <w:spacing w:after="0" w:line="240" w:lineRule="auto"/>
             </w:pPr>
             <w:r>
@@ -17069,6 +17601,7 @@
           </w:tcPr>
           <w:p>
             <w:pPr>
+              <w:keepNext/>
               <w:spacing w:after="0" w:line="240" w:lineRule="auto"/>
             </w:pPr>
             <w:r>
@@ -17099,6 +17632,7 @@
           </w:tcPr>
           <w:p>
             <w:pPr>
+              <w:keepNext/>
               <w:spacing w:after="0" w:line="240" w:lineRule="auto"/>
             </w:pPr>
             <w:r>
@@ -17124,6 +17658,7 @@
           </w:tcPr>
           <w:p>
             <w:pPr>
+              <w:keepNext/>
               <w:spacing w:after="0" w:line="240" w:lineRule="auto"/>
             </w:pPr>
             <w:r>
@@ -17154,6 +17689,7 @@
           </w:tcPr>
           <w:p>
             <w:pPr>
+              <w:keepNext/>
               <w:spacing w:after="0" w:line="240" w:lineRule="auto"/>
             </w:pPr>
             <w:r>
@@ -17179,6 +17715,7 @@
           </w:tcPr>
           <w:p>
             <w:pPr>
+              <w:keepNext/>
               <w:spacing w:after="0" w:line="240" w:lineRule="auto"/>
             </w:pPr>
             <w:r>
@@ -17217,6 +17754,7 @@
           </w:tcPr>
           <w:p>
             <w:pPr>
+              <w:keepNext/>
               <w:spacing w:after="0" w:line="240" w:lineRule="auto"/>
             </w:pPr>
             <w:r>
@@ -17242,6 +17780,7 @@
           </w:tcPr>
           <w:p>
             <w:pPr>
+              <w:keepNext/>
               <w:spacing w:after="0" w:line="240" w:lineRule="auto"/>
             </w:pPr>
             <w:r>
@@ -17379,6 +17918,7 @@
           </w:tcPr>
           <w:p>
             <w:pPr>
+              <w:keepNext/>
               <w:jc w:val="center"/>
             </w:pPr>
             <w:r>
@@ -17406,6 +17946,7 @@
           </w:tcPr>
           <w:p>
             <w:pPr>
+              <w:keepNext/>
               <w:jc w:val="center"/>
             </w:pPr>
             <w:r>
@@ -17437,6 +17978,7 @@
           </w:tcPr>
           <w:p>
             <w:pPr>
+              <w:keepNext/>
               <w:spacing w:after="0" w:line="240" w:lineRule="auto"/>
             </w:pPr>
             <w:r>
@@ -17462,15 +18004,16 @@
           </w:tcPr>
           <w:p>
             <w:pPr>
-              <w:spacing w:after="0" w:line="240" w:lineRule="auto"/>
-            </w:pPr>
-            <w:r>
-              <w:rPr>
-                <w:rFonts w:ascii="Malgun Gothic" w:hAnsi="Malgun Gothic" w:eastAsia="Malgun Gothic"/>
-                <w:color w:val="1F2937"/>
-                <w:sz w:val="16"/>
-              </w:rPr>
-              <w:t>REQ-FUNC-041,REQ-FUNC-043</w:t>
+              <w:keepNext/>
+              <w:spacing w:after="0" w:line="240" w:lineRule="auto"/>
+            </w:pPr>
+            <w:r>
+              <w:rPr>
+                <w:rFonts w:ascii="Malgun Gothic" w:hAnsi="Malgun Gothic" w:eastAsia="Malgun Gothic"/>
+                <w:color w:val="1F2937"/>
+                <w:sz w:val="16"/>
+              </w:rPr>
+              <w:t>REQ-FUNC-040~041, REQ-FUNC-043</w:t>
             </w:r>
           </w:p>
         </w:tc>
@@ -17492,6 +18035,7 @@
           </w:tcPr>
           <w:p>
             <w:pPr>
+              <w:keepNext/>
               <w:spacing w:after="0" w:line="240" w:lineRule="auto"/>
             </w:pPr>
             <w:r>
@@ -17517,6 +18061,7 @@
           </w:tcPr>
           <w:p>
             <w:pPr>
+              <w:keepNext/>
               <w:spacing w:after="0" w:line="240" w:lineRule="auto"/>
             </w:pPr>
             <w:r>
@@ -17547,6 +18092,7 @@
           </w:tcPr>
           <w:p>
             <w:pPr>
+              <w:keepNext/>
               <w:spacing w:after="0" w:line="240" w:lineRule="auto"/>
             </w:pPr>
             <w:r>
@@ -17572,6 +18118,7 @@
           </w:tcPr>
           <w:p>
             <w:pPr>
+              <w:keepNext/>
               <w:spacing w:after="0" w:line="240" w:lineRule="auto"/>
             </w:pPr>
             <w:r>
@@ -17602,6 +18149,7 @@
           </w:tcPr>
           <w:p>
             <w:pPr>
+              <w:keepNext/>
               <w:spacing w:after="0" w:line="240" w:lineRule="auto"/>
             </w:pPr>
             <w:r>
@@ -17627,6 +18175,7 @@
           </w:tcPr>
           <w:p>
             <w:pPr>
+              <w:keepNext/>
               <w:spacing w:after="0" w:line="240" w:lineRule="auto"/>
             </w:pPr>
             <w:r>
@@ -17657,6 +18206,7 @@
           </w:tcPr>
           <w:p>
             <w:pPr>
+              <w:keepNext/>
               <w:spacing w:after="0" w:line="240" w:lineRule="auto"/>
             </w:pPr>
             <w:r>
@@ -17682,6 +18232,7 @@
           </w:tcPr>
           <w:p>
             <w:pPr>
+              <w:keepNext/>
               <w:spacing w:after="0" w:line="240" w:lineRule="auto"/>
             </w:pPr>
             <w:r>
@@ -17718,6 +18269,7 @@
           </w:tcPr>
           <w:p>
             <w:pPr>
+              <w:keepNext/>
               <w:spacing w:after="0" w:line="240" w:lineRule="auto"/>
             </w:pPr>
             <w:r>
@@ -17743,6 +18295,7 @@
           </w:tcPr>
           <w:p>
             <w:pPr>
+              <w:keepNext/>
               <w:spacing w:after="0" w:line="240" w:lineRule="auto"/>
             </w:pPr>
             <w:r>
@@ -17872,6 +18425,7 @@
           </w:tcPr>
           <w:p>
             <w:pPr>
+              <w:keepNext/>
               <w:jc w:val="center"/>
             </w:pPr>
             <w:r>
@@ -17899,6 +18453,7 @@
           </w:tcPr>
           <w:p>
             <w:pPr>
+              <w:keepNext/>
               <w:jc w:val="center"/>
             </w:pPr>
             <w:r>
@@ -17930,6 +18485,7 @@
           </w:tcPr>
           <w:p>
             <w:pPr>
+              <w:keepNext/>
               <w:spacing w:after="0" w:line="240" w:lineRule="auto"/>
             </w:pPr>
             <w:r>
@@ -17955,15 +18511,16 @@
           </w:tcPr>
           <w:p>
             <w:pPr>
-              <w:spacing w:after="0" w:line="240" w:lineRule="auto"/>
-            </w:pPr>
-            <w:r>
-              <w:rPr>
-                <w:rFonts w:ascii="Malgun Gothic" w:hAnsi="Malgun Gothic" w:eastAsia="Malgun Gothic"/>
-                <w:color w:val="1F2937"/>
-                <w:sz w:val="16"/>
-              </w:rPr>
-              <w:t>REQ-FUNC-042</w:t>
+              <w:keepNext/>
+              <w:spacing w:after="0" w:line="240" w:lineRule="auto"/>
+            </w:pPr>
+            <w:r>
+              <w:rPr>
+                <w:rFonts w:ascii="Malgun Gothic" w:hAnsi="Malgun Gothic" w:eastAsia="Malgun Gothic"/>
+                <w:color w:val="1F2937"/>
+                <w:sz w:val="16"/>
+              </w:rPr>
+              <w:t>REQ-FUNC-040, REQ-FUNC-042</w:t>
             </w:r>
           </w:p>
         </w:tc>
@@ -17985,6 +18542,7 @@
           </w:tcPr>
           <w:p>
             <w:pPr>
+              <w:keepNext/>
               <w:spacing w:after="0" w:line="240" w:lineRule="auto"/>
             </w:pPr>
             <w:r>
@@ -18010,6 +18568,7 @@
           </w:tcPr>
           <w:p>
             <w:pPr>
+              <w:keepNext/>
               <w:spacing w:after="0" w:line="240" w:lineRule="auto"/>
             </w:pPr>
             <w:r>
@@ -18040,6 +18599,7 @@
           </w:tcPr>
           <w:p>
             <w:pPr>
+              <w:keepNext/>
               <w:spacing w:after="0" w:line="240" w:lineRule="auto"/>
             </w:pPr>
             <w:r>
@@ -18065,6 +18625,7 @@
           </w:tcPr>
           <w:p>
             <w:pPr>
+              <w:keepNext/>
               <w:spacing w:after="0" w:line="240" w:lineRule="auto"/>
             </w:pPr>
             <w:r>
@@ -18095,6 +18656,7 @@
           </w:tcPr>
           <w:p>
             <w:pPr>
+              <w:keepNext/>
               <w:spacing w:after="0" w:line="240" w:lineRule="auto"/>
             </w:pPr>
             <w:r>
@@ -18120,6 +18682,7 @@
           </w:tcPr>
           <w:p>
             <w:pPr>
+              <w:keepNext/>
               <w:spacing w:after="0" w:line="240" w:lineRule="auto"/>
             </w:pPr>
             <w:r>
@@ -18150,6 +18713,7 @@
           </w:tcPr>
           <w:p>
             <w:pPr>
+              <w:keepNext/>
               <w:spacing w:after="0" w:line="240" w:lineRule="auto"/>
             </w:pPr>
             <w:r>
@@ -18175,6 +18739,7 @@
           </w:tcPr>
           <w:p>
             <w:pPr>
+              <w:keepNext/>
               <w:spacing w:after="0" w:line="240" w:lineRule="auto"/>
             </w:pPr>
             <w:r>
@@ -18211,6 +18776,7 @@
           </w:tcPr>
           <w:p>
             <w:pPr>
+              <w:keepNext/>
               <w:spacing w:after="0" w:line="240" w:lineRule="auto"/>
             </w:pPr>
             <w:r>
@@ -18236,6 +18802,7 @@
           </w:tcPr>
           <w:p>
             <w:pPr>
+              <w:keepNext/>
               <w:spacing w:after="0" w:line="240" w:lineRule="auto"/>
             </w:pPr>
             <w:r>
@@ -18365,6 +18932,7 @@
           </w:tcPr>
           <w:p>
             <w:pPr>
+              <w:keepNext/>
               <w:jc w:val="center"/>
             </w:pPr>
             <w:r>
@@ -18392,6 +18960,7 @@
           </w:tcPr>
           <w:p>
             <w:pPr>
+              <w:keepNext/>
               <w:jc w:val="center"/>
             </w:pPr>
             <w:r>
@@ -18423,6 +18992,7 @@
           </w:tcPr>
           <w:p>
             <w:pPr>
+              <w:keepNext/>
               <w:spacing w:after="0" w:line="240" w:lineRule="auto"/>
             </w:pPr>
             <w:r>
@@ -18448,15 +19018,16 @@
           </w:tcPr>
           <w:p>
             <w:pPr>
-              <w:spacing w:after="0" w:line="240" w:lineRule="auto"/>
-            </w:pPr>
-            <w:r>
-              <w:rPr>
-                <w:rFonts w:ascii="Malgun Gothic" w:hAnsi="Malgun Gothic" w:eastAsia="Malgun Gothic"/>
-                <w:color w:val="1F2937"/>
-                <w:sz w:val="16"/>
-              </w:rPr>
-              <w:t>REQ-FUNC-044</w:t>
+              <w:keepNext/>
+              <w:spacing w:after="0" w:line="240" w:lineRule="auto"/>
+            </w:pPr>
+            <w:r>
+              <w:rPr>
+                <w:rFonts w:ascii="Malgun Gothic" w:hAnsi="Malgun Gothic" w:eastAsia="Malgun Gothic"/>
+                <w:color w:val="1F2937"/>
+                <w:sz w:val="16"/>
+              </w:rPr>
+              <w:t>REQ-FUNC-040, REQ-FUNC-044</w:t>
             </w:r>
           </w:p>
         </w:tc>
@@ -18478,6 +19049,7 @@
           </w:tcPr>
           <w:p>
             <w:pPr>
+              <w:keepNext/>
               <w:spacing w:after="0" w:line="240" w:lineRule="auto"/>
             </w:pPr>
             <w:r>
@@ -18503,6 +19075,7 @@
           </w:tcPr>
           <w:p>
             <w:pPr>
+              <w:keepNext/>
               <w:spacing w:after="0" w:line="240" w:lineRule="auto"/>
             </w:pPr>
             <w:r>
@@ -18533,6 +19106,7 @@
           </w:tcPr>
           <w:p>
             <w:pPr>
+              <w:keepNext/>
               <w:spacing w:after="0" w:line="240" w:lineRule="auto"/>
             </w:pPr>
             <w:r>
@@ -18558,6 +19132,7 @@
           </w:tcPr>
           <w:p>
             <w:pPr>
+              <w:keepNext/>
               <w:spacing w:after="0" w:line="240" w:lineRule="auto"/>
             </w:pPr>
             <w:r>
@@ -18588,6 +19163,7 @@
           </w:tcPr>
           <w:p>
             <w:pPr>
+              <w:keepNext/>
               <w:spacing w:after="0" w:line="240" w:lineRule="auto"/>
             </w:pPr>
             <w:r>
@@ -18613,6 +19189,7 @@
           </w:tcPr>
           <w:p>
             <w:pPr>
+              <w:keepNext/>
               <w:spacing w:after="0" w:line="240" w:lineRule="auto"/>
             </w:pPr>
             <w:r>
@@ -18643,6 +19220,7 @@
           </w:tcPr>
           <w:p>
             <w:pPr>
+              <w:keepNext/>
               <w:spacing w:after="0" w:line="240" w:lineRule="auto"/>
             </w:pPr>
             <w:r>
@@ -18668,6 +19246,7 @@
           </w:tcPr>
           <w:p>
             <w:pPr>
+              <w:keepNext/>
               <w:spacing w:after="0" w:line="240" w:lineRule="auto"/>
             </w:pPr>
             <w:r>
@@ -18702,6 +19281,7 @@
           </w:tcPr>
           <w:p>
             <w:pPr>
+              <w:keepNext/>
               <w:spacing w:after="0" w:line="240" w:lineRule="auto"/>
             </w:pPr>
             <w:r>
@@ -18727,6 +19307,7 @@
           </w:tcPr>
           <w:p>
             <w:pPr>
+              <w:keepNext/>
               <w:spacing w:after="0" w:line="240" w:lineRule="auto"/>
             </w:pPr>
             <w:r>
@@ -18923,6 +19504,7 @@
           </w:tcPr>
           <w:p>
             <w:pPr>
+              <w:keepNext/>
               <w:jc w:val="center"/>
             </w:pPr>
             <w:r>
@@ -18950,6 +19532,7 @@
           </w:tcPr>
           <w:p>
             <w:pPr>
+              <w:keepNext/>
               <w:jc w:val="center"/>
             </w:pPr>
             <w:r>
@@ -18981,6 +19564,7 @@
           </w:tcPr>
           <w:p>
             <w:pPr>
+              <w:keepNext/>
               <w:spacing w:after="0" w:line="240" w:lineRule="auto"/>
             </w:pPr>
             <w:r>
@@ -19006,15 +19590,16 @@
           </w:tcPr>
           <w:p>
             <w:pPr>
-              <w:spacing w:after="0" w:line="240" w:lineRule="auto"/>
-            </w:pPr>
-            <w:r>
-              <w:rPr>
-                <w:rFonts w:ascii="Malgun Gothic" w:hAnsi="Malgun Gothic" w:eastAsia="Malgun Gothic"/>
-                <w:color w:val="1F2937"/>
-                <w:sz w:val="16"/>
-              </w:rPr>
-              <w:t>REQ-ERR-004~006; REQ-DIAG-001,REQ-DIAG-004; REQ-IF-009~010</w:t>
+              <w:keepNext/>
+              <w:spacing w:after="0" w:line="240" w:lineRule="auto"/>
+            </w:pPr>
+            <w:r>
+              <w:rPr>
+                <w:rFonts w:ascii="Malgun Gothic" w:hAnsi="Malgun Gothic" w:eastAsia="Malgun Gothic"/>
+                <w:color w:val="1F2937"/>
+                <w:sz w:val="16"/>
+              </w:rPr>
+              <w:t>REQ-IF-004~005, REQ-IF-009~010; REQ-ERR-004~006; REQ-DIAG-001; REQ-COMP-006; REQ-SEC-003</w:t>
             </w:r>
           </w:p>
         </w:tc>
@@ -19036,6 +19621,7 @@
           </w:tcPr>
           <w:p>
             <w:pPr>
+              <w:keepNext/>
               <w:spacing w:after="0" w:line="240" w:lineRule="auto"/>
             </w:pPr>
             <w:r>
@@ -19061,6 +19647,7 @@
           </w:tcPr>
           <w:p>
             <w:pPr>
+              <w:keepNext/>
               <w:spacing w:after="0" w:line="240" w:lineRule="auto"/>
             </w:pPr>
             <w:r>
@@ -19091,6 +19678,7 @@
           </w:tcPr>
           <w:p>
             <w:pPr>
+              <w:keepNext/>
               <w:spacing w:after="0" w:line="240" w:lineRule="auto"/>
             </w:pPr>
             <w:r>
@@ -19116,6 +19704,7 @@
           </w:tcPr>
           <w:p>
             <w:pPr>
+              <w:keepNext/>
               <w:spacing w:after="0" w:line="240" w:lineRule="auto"/>
             </w:pPr>
             <w:r>
@@ -19146,6 +19735,7 @@
           </w:tcPr>
           <w:p>
             <w:pPr>
+              <w:keepNext/>
               <w:spacing w:after="0" w:line="240" w:lineRule="auto"/>
             </w:pPr>
             <w:r>
@@ -19171,6 +19761,7 @@
           </w:tcPr>
           <w:p>
             <w:pPr>
+              <w:keepNext/>
               <w:spacing w:after="0" w:line="240" w:lineRule="auto"/>
             </w:pPr>
             <w:r>
@@ -19201,6 +19792,7 @@
           </w:tcPr>
           <w:p>
             <w:pPr>
+              <w:keepNext/>
               <w:spacing w:after="0" w:line="240" w:lineRule="auto"/>
             </w:pPr>
             <w:r>
@@ -19226,6 +19818,7 @@
           </w:tcPr>
           <w:p>
             <w:pPr>
+              <w:keepNext/>
               <w:spacing w:after="0" w:line="240" w:lineRule="auto"/>
             </w:pPr>
             <w:r>
@@ -19260,6 +19853,7 @@
           </w:tcPr>
           <w:p>
             <w:pPr>
+              <w:keepNext/>
               <w:spacing w:after="0" w:line="240" w:lineRule="auto"/>
             </w:pPr>
             <w:r>
@@ -19285,6 +19879,7 @@
           </w:tcPr>
           <w:p>
             <w:pPr>
+              <w:keepNext/>
               <w:spacing w:after="0" w:line="240" w:lineRule="auto"/>
             </w:pPr>
             <w:r>
@@ -19414,6 +20009,7 @@
           </w:tcPr>
           <w:p>
             <w:pPr>
+              <w:keepNext/>
               <w:jc w:val="center"/>
             </w:pPr>
             <w:r>
@@ -19441,6 +20037,7 @@
           </w:tcPr>
           <w:p>
             <w:pPr>
+              <w:keepNext/>
               <w:jc w:val="center"/>
             </w:pPr>
             <w:r>
@@ -19472,6 +20069,7 @@
           </w:tcPr>
           <w:p>
             <w:pPr>
+              <w:keepNext/>
               <w:spacing w:after="0" w:line="240" w:lineRule="auto"/>
             </w:pPr>
             <w:r>
@@ -19497,15 +20095,16 @@
           </w:tcPr>
           <w:p>
             <w:pPr>
-              <w:spacing w:after="0" w:line="240" w:lineRule="auto"/>
-            </w:pPr>
-            <w:r>
-              <w:rPr>
-                <w:rFonts w:ascii="Malgun Gothic" w:hAnsi="Malgun Gothic" w:eastAsia="Malgun Gothic"/>
-                <w:color w:val="1F2937"/>
-                <w:sz w:val="16"/>
-              </w:rPr>
-              <w:t>REQ-ERR-006~008; REQ-DIAG-002~005; REQ-RES-003~004</w:t>
+              <w:keepNext/>
+              <w:spacing w:after="0" w:line="240" w:lineRule="auto"/>
+            </w:pPr>
+            <w:r>
+              <w:rPr>
+                <w:rFonts w:ascii="Malgun Gothic" w:hAnsi="Malgun Gothic" w:eastAsia="Malgun Gothic"/>
+                <w:color w:val="1F2937"/>
+                <w:sz w:val="16"/>
+              </w:rPr>
+              <w:t>REQ-FUNC-035; REQ-IF-004, REQ-IF-009, REQ-IF-011; REQ-ERR-001, REQ-ERR-004~007; REQ-REL-002, REQ-REL-004; REQ-RES-003~004; REQ-DIAG-002~005; REQ-COMP-006</w:t>
             </w:r>
           </w:p>
         </w:tc>
@@ -19527,6 +20126,7 @@
           </w:tcPr>
           <w:p>
             <w:pPr>
+              <w:keepNext/>
               <w:spacing w:after="0" w:line="240" w:lineRule="auto"/>
             </w:pPr>
             <w:r>
@@ -19552,6 +20152,7 @@
           </w:tcPr>
           <w:p>
             <w:pPr>
+              <w:keepNext/>
               <w:spacing w:after="0" w:line="240" w:lineRule="auto"/>
             </w:pPr>
             <w:r>
@@ -19582,6 +20183,7 @@
           </w:tcPr>
           <w:p>
             <w:pPr>
+              <w:keepNext/>
               <w:spacing w:after="0" w:line="240" w:lineRule="auto"/>
             </w:pPr>
             <w:r>
@@ -19607,6 +20209,7 @@
           </w:tcPr>
           <w:p>
             <w:pPr>
+              <w:keepNext/>
               <w:spacing w:after="0" w:line="240" w:lineRule="auto"/>
             </w:pPr>
             <w:r>
@@ -19637,6 +20240,7 @@
           </w:tcPr>
           <w:p>
             <w:pPr>
+              <w:keepNext/>
               <w:spacing w:after="0" w:line="240" w:lineRule="auto"/>
             </w:pPr>
             <w:r>
@@ -19662,6 +20266,7 @@
           </w:tcPr>
           <w:p>
             <w:pPr>
+              <w:keepNext/>
               <w:spacing w:after="0" w:line="240" w:lineRule="auto"/>
             </w:pPr>
             <w:r>
@@ -19692,6 +20297,7 @@
           </w:tcPr>
           <w:p>
             <w:pPr>
+              <w:keepNext/>
               <w:spacing w:after="0" w:line="240" w:lineRule="auto"/>
             </w:pPr>
             <w:r>
@@ -19717,6 +20323,7 @@
           </w:tcPr>
           <w:p>
             <w:pPr>
+              <w:keepNext/>
               <w:spacing w:after="0" w:line="240" w:lineRule="auto"/>
             </w:pPr>
             <w:r>
@@ -19753,6 +20360,7 @@
           </w:tcPr>
           <w:p>
             <w:pPr>
+              <w:keepNext/>
               <w:spacing w:after="0" w:line="240" w:lineRule="auto"/>
             </w:pPr>
             <w:r>
@@ -19778,6 +20386,7 @@
           </w:tcPr>
           <w:p>
             <w:pPr>
+              <w:keepNext/>
               <w:spacing w:after="0" w:line="240" w:lineRule="auto"/>
             </w:pPr>
             <w:r>
@@ -19969,6 +20578,7 @@
           </w:tcPr>
           <w:p>
             <w:pPr>
+              <w:keepNext/>
               <w:jc w:val="center"/>
             </w:pPr>
             <w:r>
@@ -19996,6 +20606,7 @@
           </w:tcPr>
           <w:p>
             <w:pPr>
+              <w:keepNext/>
               <w:jc w:val="center"/>
             </w:pPr>
             <w:r>
@@ -20027,6 +20638,7 @@
           </w:tcPr>
           <w:p>
             <w:pPr>
+              <w:keepNext/>
               <w:spacing w:after="0" w:line="240" w:lineRule="auto"/>
             </w:pPr>
             <w:r>
@@ -20052,15 +20664,16 @@
           </w:tcPr>
           <w:p>
             <w:pPr>
-              <w:spacing w:after="0" w:line="240" w:lineRule="auto"/>
-            </w:pPr>
-            <w:r>
-              <w:rPr>
-                <w:rFonts w:ascii="Malgun Gothic" w:hAnsi="Malgun Gothic" w:eastAsia="Malgun Gothic"/>
-                <w:color w:val="1F2937"/>
-                <w:sz w:val="16"/>
-              </w:rPr>
-              <w:t>REQ-FUNC-008; REQ-PERF-006; REQ-RES-002</w:t>
+              <w:keepNext/>
+              <w:spacing w:after="0" w:line="240" w:lineRule="auto"/>
+            </w:pPr>
+            <w:r>
+              <w:rPr>
+                <w:rFonts w:ascii="Malgun Gothic" w:hAnsi="Malgun Gothic" w:eastAsia="Malgun Gothic"/>
+                <w:color w:val="1F2937"/>
+                <w:sz w:val="16"/>
+              </w:rPr>
+              <w:t>REQ-FUNC-008; REQ-PERF-006; REQ-REL-003; REQ-RES-002</w:t>
             </w:r>
           </w:p>
         </w:tc>
@@ -20082,6 +20695,7 @@
           </w:tcPr>
           <w:p>
             <w:pPr>
+              <w:keepNext/>
               <w:spacing w:after="0" w:line="240" w:lineRule="auto"/>
             </w:pPr>
             <w:r>
@@ -20107,6 +20721,7 @@
           </w:tcPr>
           <w:p>
             <w:pPr>
+              <w:keepNext/>
               <w:spacing w:after="0" w:line="240" w:lineRule="auto"/>
             </w:pPr>
             <w:r>
@@ -20137,6 +20752,7 @@
           </w:tcPr>
           <w:p>
             <w:pPr>
+              <w:keepNext/>
               <w:spacing w:after="0" w:line="240" w:lineRule="auto"/>
             </w:pPr>
             <w:r>
@@ -20162,6 +20778,7 @@
           </w:tcPr>
           <w:p>
             <w:pPr>
+              <w:keepNext/>
               <w:spacing w:after="0" w:line="240" w:lineRule="auto"/>
             </w:pPr>
             <w:r>
@@ -20192,6 +20809,7 @@
           </w:tcPr>
           <w:p>
             <w:pPr>
+              <w:keepNext/>
               <w:spacing w:after="0" w:line="240" w:lineRule="auto"/>
             </w:pPr>
             <w:r>
@@ -20217,6 +20835,7 @@
           </w:tcPr>
           <w:p>
             <w:pPr>
+              <w:keepNext/>
               <w:spacing w:after="0" w:line="240" w:lineRule="auto"/>
             </w:pPr>
             <w:r>
@@ -20247,6 +20866,7 @@
           </w:tcPr>
           <w:p>
             <w:pPr>
+              <w:keepNext/>
               <w:spacing w:after="0" w:line="240" w:lineRule="auto"/>
             </w:pPr>
             <w:r>
@@ -20272,6 +20892,7 @@
           </w:tcPr>
           <w:p>
             <w:pPr>
+              <w:keepNext/>
               <w:spacing w:after="0" w:line="240" w:lineRule="auto"/>
             </w:pPr>
             <w:r>
@@ -20310,6 +20931,7 @@
           </w:tcPr>
           <w:p>
             <w:pPr>
+              <w:keepNext/>
               <w:spacing w:after="0" w:line="240" w:lineRule="auto"/>
             </w:pPr>
             <w:r>
@@ -20335,6 +20957,7 @@
           </w:tcPr>
           <w:p>
             <w:pPr>
+              <w:keepNext/>
               <w:spacing w:after="0" w:line="240" w:lineRule="auto"/>
             </w:pPr>
             <w:r>
@@ -20789,6 +21412,8 @@
     <w:sectPr>
       <w:headerReference w:type="default" r:id="rId9"/>
       <w:footerReference w:type="default" r:id="rId10"/>
+      <w:footerReference w:type="first" r:id="rId18"/>
+      <w:footerReference w:type="even" r:id="rId19"/>
       <w:pgSz w:w="12240" w:h="15840"/>
       <w:pgMar w:top="1440" w:right="1440" w:bottom="1440" w:left="1440" w:header="708" w:footer="708" w:gutter="0"/>
       <w:cols w:space="720"/>
@@ -20884,7 +21509,7 @@
               <w:color w:val="64748B"/>
               <w:sz w:val="16"/>
             </w:rPr>
-            <w:t>Version 0.9 | Baseline Candidate</w:t>
+            <w:t>Version 0.10 | Baseline Candidate</w:t>
           </w:r>
         </w:p>
       </w:tc>
@@ -20925,6 +21550,26 @@
       </w:tc>
     </w:tr>
   </w:tbl>
+</w:ftr>
+</file>
+
+<file path=word/footer2.xml><?xml version="1.0" encoding="utf-8"?>
+<w:ftr xmlns:m="http://schemas.openxmlformats.org/officeDocument/2006/math" xmlns:mc="http://schemas.openxmlformats.org/markup-compatibility/2006" xmlns:mo="http://schemas.microsoft.com/office/mac/office/2008/main" xmlns:mv="urn:schemas-microsoft-com:mac:vml" xmlns:o="urn:schemas-microsoft-com:office:office" xmlns:r="http://schemas.openxmlformats.org/officeDocument/2006/relationships" xmlns:v="urn:schemas-microsoft-com:vml" xmlns:w10="urn:schemas-microsoft-com:office:word" xmlns:w14="http://schemas.microsoft.com/office/word/2010/wordml" xmlns:w="http://schemas.openxmlformats.org/wordprocessingml/2006/main" xmlns:wne="http://schemas.microsoft.com/office/word/2006/wordml" xmlns:wp14="http://schemas.microsoft.com/office/word/2010/wordprocessingDrawing" xmlns:wp="http://schemas.openxmlformats.org/drawingml/2006/wordprocessingDrawing" xmlns:wpc="http://schemas.microsoft.com/office/word/2010/wordprocessingCanvas" xmlns:wpg="http://schemas.microsoft.com/office/word/2010/wordprocessingGroup" xmlns:wpi="http://schemas.microsoft.com/office/word/2010/wordprocessingInk" xmlns:wps="http://schemas.microsoft.com/office/word/2010/wordprocessingShape" mc:Ignorable="w14 wp14">
+  <w:p>
+    <w:pPr>
+      <w:pStyle w:val="Footer"/>
+    </w:pPr>
+  </w:p>
+</w:ftr>
+</file>
+
+<file path=word/footer3.xml><?xml version="1.0" encoding="utf-8"?>
+<w:ftr xmlns:m="http://schemas.openxmlformats.org/officeDocument/2006/math" xmlns:mc="http://schemas.openxmlformats.org/markup-compatibility/2006" xmlns:mo="http://schemas.microsoft.com/office/mac/office/2008/main" xmlns:mv="urn:schemas-microsoft-com:mac:vml" xmlns:o="urn:schemas-microsoft-com:office:office" xmlns:r="http://schemas.openxmlformats.org/officeDocument/2006/relationships" xmlns:v="urn:schemas-microsoft-com:vml" xmlns:w10="urn:schemas-microsoft-com:office:word" xmlns:w14="http://schemas.microsoft.com/office/word/2010/wordml" xmlns:w="http://schemas.openxmlformats.org/wordprocessingml/2006/main" xmlns:wne="http://schemas.microsoft.com/office/word/2006/wordml" xmlns:wp14="http://schemas.microsoft.com/office/word/2010/wordprocessingDrawing" xmlns:wp="http://schemas.openxmlformats.org/drawingml/2006/wordprocessingDrawing" xmlns:wpc="http://schemas.microsoft.com/office/word/2010/wordprocessingCanvas" xmlns:wpg="http://schemas.microsoft.com/office/word/2010/wordprocessingGroup" xmlns:wpi="http://schemas.microsoft.com/office/word/2010/wordprocessingInk" xmlns:wps="http://schemas.microsoft.com/office/word/2010/wordprocessingShape" mc:Ignorable="w14 wp14">
+  <w:p>
+    <w:pPr>
+      <w:pStyle w:val="Footer"/>
+    </w:pPr>
+  </w:p>
 </w:ftr>
 </file>
 

</xml_diff>